<commit_message>
docs: address SDD v1.2.2 review findings
</commit_message>
<xml_diff>
--- a/docs/VESKIFY_SDD_v1.2.2.docx
+++ b/docs/VESKIFY_SDD_v1.2.2.docx
@@ -279,7 +279,7 @@
           <w:sz w:val="18"/>
           <w:szCs w:val="18"/>
         </w:rPr>
-        <w:t>&lt;p&gt;Veskify is the controlled storefront-design engine that powers Vesko Storefront Studio. It composes coordinated editable storefronts from controlled component families, approved page recipes and bounded design parameters; it never generates arbitrary page code or a competing storefront model.&lt;/p&gt;&lt;/th&gt;</w:t>
+        <w:t>&lt;p&gt;Veskify is the controlled storefront-design engine that powers Vesko Storefront Studio. It composes coordinated editable storefronts from controlled component families, registered PageBlueprint recipe profiles and bounded design parameters; it never generates arbitrary page code or a competing storefront model.&lt;/p&gt;&lt;/th&gt;</w:t>
       </w:r>
     </w:p>
     <w:p>
@@ -623,40 +623,73 @@
           <w:sz w:val="18"/>
           <w:szCs w:val="18"/>
         </w:rPr>
-        <w:t>| **Source basis**               | VESKIFY SDD v1.1, the approved Vesko Storefront Studio product-design direction, repository evidence at the amendment source commit and explicitly recorded evidence limitations.                       |</w:t>
-      </w:r>
-    </w:p>
-    <w:p>
-      <w:pPr/>
-      <w:r>
-        <w:rPr>
-          <w:rFonts w:ascii="Helvetica Light" w:hAnsi="Helvetica Light" w:cs="Helvetica Light"/>
-          <w:sz w:val="18"/>
-          <w:szCs w:val="18"/>
-        </w:rPr>
-        <w:t>| **Amendment source commit**    | `8174b1a6d31301b4072622e2e3ef675957479121` (`origin/main` at amendment start).                                                                                                                            |</w:t>
-      </w:r>
-    </w:p>
-    <w:p>
-      <w:pPr/>
-      <w:r>
-        <w:rPr>
-          <w:rFonts w:ascii="Helvetica Light" w:hAnsi="Helvetica Light" w:cs="Helvetica Light"/>
-          <w:sz w:val="18"/>
-          <w:szCs w:val="18"/>
-        </w:rPr>
-        <w:t>| **Amendment branch**           | `codex/sdd-v1.2.1-grounded-storefront-generator`.                                                                                                                                                         |</w:t>
-      </w:r>
-    </w:p>
-    <w:p>
-      <w:pPr/>
-      <w:r>
-        <w:rPr>
-          <w:rFonts w:ascii="Helvetica Light" w:hAnsi="Helvetica Light" w:cs="Helvetica Light"/>
-          <w:sz w:val="18"/>
-          <w:szCs w:val="18"/>
-        </w:rPr>
-        <w:t>| **Amendment PR**               | Pending when this branch was prepared; the Ready PR is the delivery record.                                                                                                                               |</w:t>
+        <w:t>| **Source basis**               | VESKIFY SDD v1.1, the approved Vesko Storefront Studio product-design direction, repository evidence at each stated amendment baseline and explicitly recorded evidence limitations.                  |</w:t>
+      </w:r>
+    </w:p>
+    <w:p>
+      <w:pPr/>
+      <w:r>
+        <w:rPr>
+          <w:rFonts w:ascii="Helvetica Light" w:hAnsi="Helvetica Light" w:cs="Helvetica Light"/>
+          <w:sz w:val="18"/>
+          <w:szCs w:val="18"/>
+        </w:rPr>
+        <w:t>| **Historical v1.2.1 baseline** | `8174b1a6d31301b4072622e2e3ef675957479121`; the earlier corrective-amendment baseline, not the v1.2.2 source.                                                                                              |</w:t>
+      </w:r>
+    </w:p>
+    <w:p>
+      <w:pPr/>
+      <w:r>
+        <w:rPr>
+          <w:rFonts w:ascii="Helvetica Light" w:hAnsi="Helvetica Light" w:cs="Helvetica Light"/>
+          <w:sz w:val="18"/>
+          <w:szCs w:val="18"/>
+        </w:rPr>
+        <w:t>| **Historical v1.2.1 branch**   | `codex/sdd-v1.2.1-grounded-storefront-generator`; retained as historical provenance only.                                                                                                                |</w:t>
+      </w:r>
+    </w:p>
+    <w:p>
+      <w:pPr/>
+      <w:r>
+        <w:rPr>
+          <w:rFonts w:ascii="Helvetica Light" w:hAnsi="Helvetica Light" w:cs="Helvetica Light"/>
+          <w:sz w:val="18"/>
+          <w:szCs w:val="18"/>
+        </w:rPr>
+        <w:t>| **v1.2.2 amendment baseline**  | `4a96a5a5567b83e62306f73f7069e0e09f0c8683` (`origin/main` at the commercial-design-vocabulary amendment start and the merge commit containing P9R-06).                                                  |</w:t>
+      </w:r>
+    </w:p>
+    <w:p>
+      <w:pPr/>
+      <w:r>
+        <w:rPr>
+          <w:rFonts w:ascii="Helvetica Light" w:hAnsi="Helvetica Light" w:cs="Helvetica Light"/>
+          <w:sz w:val="18"/>
+          <w:szCs w:val="18"/>
+        </w:rPr>
+        <w:t>| **v1.2.2 amendment branch**    | `codex/sdd-v1-2-2-commercial-design-vocabulary-recovery`.                                                                                                                                                 |</w:t>
+      </w:r>
+    </w:p>
+    <w:p>
+      <w:pPr/>
+      <w:r>
+        <w:rPr>
+          <w:rFonts w:ascii="Helvetica Light" w:hAnsi="Helvetica Light" w:cs="Helvetica Light"/>
+          <w:sz w:val="18"/>
+          <w:szCs w:val="18"/>
+        </w:rPr>
+        <w:t>| **Generated document version** | `docs/VESKIFY_SDD_v1.2.2.docx`, deterministically synchronized from this Markdown specification.                                                                                                          |</w:t>
+      </w:r>
+    </w:p>
+    <w:p>
+      <w:pPr/>
+      <w:r>
+        <w:rPr>
+          <w:rFonts w:ascii="Helvetica Light" w:hAnsi="Helvetica Light" w:cs="Helvetica Light"/>
+          <w:sz w:val="18"/>
+          <w:szCs w:val="18"/>
+        </w:rPr>
+        <w:t>| **Current PR delivery record** | PR #132 was automatically reviewed at initial delivery commit `bba2827e63f2027c946138f6c91362f3f989b088`; GitHub records the later review-fix delivery commit, which is not invented or embedded before it exists. |</w:t>
       </w:r>
     </w:p>
     <w:p>
@@ -869,7 +902,7 @@
           <w:sz w:val="18"/>
           <w:szCs w:val="18"/>
         </w:rPr>
-        <w:t>| 1.2.2       | 31 July 2026    | Commercial design vocabulary      | Defines controlled component families, page recipes, bounded parametric design, inheritance, reachability and visual-quality gates; it does not close Phase 9 or unblock P10A. |</w:t>
+        <w:t>| 1.2.2       | 31 July 2026    | Commercial design vocabulary      | Defines controlled component families, registered PageBlueprint recipe profiles, bounded parametric design, inheritance, reachability and visual-quality gates; it does not close Phase 9 or unblock P10A. |</w:t>
       </w:r>
     </w:p>
     <w:p/>
@@ -1118,18 +1151,18 @@
           <w:sz w:val="18"/>
           <w:szCs w:val="18"/>
         </w:rPr>
-        <w:t>The AI MUST NOT invent components, component variants, props, slots, bindings, asset roles, page</w:t>
-      </w:r>
-    </w:p>
-    <w:p>
-      <w:pPr/>
-      <w:r>
-        <w:rPr>
-          <w:rFonts w:ascii="Helvetica Light" w:hAnsi="Helvetica Light" w:cs="Helvetica Light"/>
-          <w:sz w:val="18"/>
-          <w:szCs w:val="18"/>
-        </w:rPr>
-        <w:t>recipes, adapter capabilities, operation types or versions.</w:t>
+        <w:t>The AI MUST NOT invent components, component variants, props, slots, bindings, asset roles,</w:t>
+      </w:r>
+    </w:p>
+    <w:p>
+      <w:pPr/>
+      <w:r>
+        <w:rPr>
+          <w:rFonts w:ascii="Helvetica Light" w:hAnsi="Helvetica Light" w:cs="Helvetica Light"/>
+          <w:sz w:val="18"/>
+          <w:szCs w:val="18"/>
+        </w:rPr>
+        <w:t>PageBlueprints or registered recipe profiles, adapter capabilities, operation types or versions.</w:t>
       </w:r>
     </w:p>
     <w:p/>
@@ -1220,7 +1253,7 @@
           <w:sz w:val="18"/>
           <w:szCs w:val="18"/>
         </w:rPr>
-        <w:t>| `PageBlueprint` | The approved page-composition capability; current `StorefrontTemplateDefinition` contracts are its implementation precursor and must converge rather than fork. |</w:t>
+        <w:t>| `PageBlueprint` | The canonical executable page-composition contract. A commercial recipe is only a registered, constrained profile or preset of permitted/default PageBlueprint values; current `StorefrontTemplateDefinition` contracts are its implementation precursor and must converge rather than fork. |</w:t>
       </w:r>
     </w:p>
     <w:p>
@@ -2398,29 +2431,95 @@
           <w:sz w:val="18"/>
           <w:szCs w:val="18"/>
         </w:rPr>
-        <w:t>compatibility. A blueprint is an independent generation starting point; generated output becomes</w:t>
-      </w:r>
-    </w:p>
-    <w:p>
-      <w:pPr/>
-      <w:r>
-        <w:rPr>
-          <w:rFonts w:ascii="Helvetica Light" w:hAnsi="Helvetica Light" w:cs="Helvetica Light"/>
-          <w:sz w:val="18"/>
-          <w:szCs w:val="18"/>
-        </w:rPr>
-        <w:t>ordinary snapshot state and is not silently rewritten when the blueprint later changes. Dynamic</w:t>
-      </w:r>
-    </w:p>
-    <w:p>
-      <w:pPr/>
-      <w:r>
-        <w:rPr>
-          <w:rFonts w:ascii="Helvetica Light" w:hAnsi="Helvetica Light" w:cs="Helvetica Light"/>
-          <w:sz w:val="18"/>
-          <w:szCs w:val="18"/>
-        </w:rPr>
-        <w:t>PDP and collection composition stays stable while runtime bindings resolve different entities.</w:t>
+        <w:t>compatibility. It also owns the registered commercial recipe-profile representation: a profile</w:t>
+      </w:r>
+    </w:p>
+    <w:p>
+      <w:pPr/>
+      <w:r>
+        <w:rPr>
+          <w:rFonts w:ascii="Helvetica Light" w:hAnsi="Helvetica Light" w:cs="Helvetica Light"/>
+          <w:sz w:val="18"/>
+          <w:szCs w:val="18"/>
+        </w:rPr>
+        <w:t>supplies permitted/default PageBlueprint values for required/optional slots, compatible</w:t>
+      </w:r>
+    </w:p>
+    <w:p>
+      <w:pPr/>
+      <w:r>
+        <w:rPr>
+          <w:rFonts w:ascii="Helvetica Light" w:hAnsi="Helvetica Light" w:cs="Helvetica Light"/>
+          <w:sz w:val="18"/>
+          <w:szCs w:val="18"/>
+        </w:rPr>
+        <w:t>families/variants, default and permitted ordering, data bindings, approved-asset requirements,</w:t>
+      </w:r>
+    </w:p>
+    <w:p>
+      <w:pPr/>
+      <w:r>
+        <w:rPr>
+          <w:rFonts w:ascii="Helvetica Light" w:hAnsi="Helvetica Light" w:cs="Helvetica Light"/>
+          <w:sz w:val="18"/>
+          <w:szCs w:val="18"/>
+        </w:rPr>
+        <w:t>responsive constraints, omission/fallback rules and cross-page coordination. It never becomes a</w:t>
+      </w:r>
+    </w:p>
+    <w:p>
+      <w:pPr/>
+      <w:r>
+        <w:rPr>
+          <w:rFonts w:ascii="Helvetica Light" w:hAnsi="Helvetica Light" w:cs="Helvetica Light"/>
+          <w:sz w:val="18"/>
+          <w:szCs w:val="18"/>
+        </w:rPr>
+        <w:t>separate template graph or independently executable model. Recipe selection materializes or</w:t>
+      </w:r>
+    </w:p>
+    <w:p>
+      <w:pPr/>
+      <w:r>
+        <w:rPr>
+          <w:rFonts w:ascii="Helvetica Light" w:hAnsi="Helvetica Light" w:cs="Helvetica Light"/>
+          <w:sz w:val="18"/>
+          <w:szCs w:val="18"/>
+        </w:rPr>
+        <w:t>constrains a canonical PageBlueprint. A blueprint is an independent generation starting point;</w:t>
+      </w:r>
+    </w:p>
+    <w:p>
+      <w:pPr/>
+      <w:r>
+        <w:rPr>
+          <w:rFonts w:ascii="Helvetica Light" w:hAnsi="Helvetica Light" w:cs="Helvetica Light"/>
+          <w:sz w:val="18"/>
+          <w:szCs w:val="18"/>
+        </w:rPr>
+        <w:t>generated output becomes ordinary snapshot state and is not silently rewritten when the blueprint</w:t>
+      </w:r>
+    </w:p>
+    <w:p>
+      <w:pPr/>
+      <w:r>
+        <w:rPr>
+          <w:rFonts w:ascii="Helvetica Light" w:hAnsi="Helvetica Light" w:cs="Helvetica Light"/>
+          <w:sz w:val="18"/>
+          <w:szCs w:val="18"/>
+        </w:rPr>
+        <w:t>later changes. Dynamic PDP and collection composition stays stable while runtime bindings resolve</w:t>
+      </w:r>
+    </w:p>
+    <w:p>
+      <w:pPr/>
+      <w:r>
+        <w:rPr>
+          <w:rFonts w:ascii="Helvetica Light" w:hAnsi="Helvetica Light" w:cs="Helvetica Light"/>
+          <w:sz w:val="18"/>
+          <w:szCs w:val="18"/>
+        </w:rPr>
+        <w:t>different entities.</w:t>
       </w:r>
     </w:p>
     <w:p/>
@@ -3509,6 +3608,62 @@
           <w:sz w:val="18"/>
           <w:szCs w:val="18"/>
         </w:rPr>
+        <w:t>AC-136 through AC-138 are P10A commercial-design-vocabulary acceptance criteria implemented by</w:t>
+      </w:r>
+    </w:p>
+    <w:p>
+      <w:pPr/>
+      <w:r>
+        <w:rPr>
+          <w:rFonts w:ascii="Helvetica Light" w:hAnsi="Helvetica Light" w:cs="Helvetica Light"/>
+          <w:sz w:val="18"/>
+          <w:szCs w:val="18"/>
+        </w:rPr>
+        <w:t>P10A Tasks 6–9 after the existing Phase 9 gate closes. They are not required to close Phase 9 and</w:t>
+      </w:r>
+    </w:p>
+    <w:p>
+      <w:pPr/>
+      <w:r>
+        <w:rPr>
+          <w:rFonts w:ascii="Helvetica Light" w:hAnsi="Helvetica Light" w:cs="Helvetica Light"/>
+          <w:sz w:val="18"/>
+          <w:szCs w:val="18"/>
+        </w:rPr>
+        <w:t>this documentation amendment does not satisfy them. Phase 9 remains open for its existing</w:t>
+      </w:r>
+    </w:p>
+    <w:p>
+      <w:pPr/>
+      <w:r>
+        <w:rPr>
+          <w:rFonts w:ascii="Helvetica Light" w:hAnsi="Helvetica Light" w:cs="Helvetica Light"/>
+          <w:sz w:val="18"/>
+          <w:szCs w:val="18"/>
+        </w:rPr>
+        <w:t>whole-storefront generation, approved-brief handoff, protected-commerce, lifecycle, responsive,</w:t>
+      </w:r>
+    </w:p>
+    <w:p>
+      <w:pPr/>
+      <w:r>
+        <w:rPr>
+          <w:rFonts w:ascii="Helvetica Light" w:hAnsi="Helvetica Light" w:cs="Helvetica Light"/>
+          <w:sz w:val="18"/>
+          <w:szCs w:val="18"/>
+        </w:rPr>
+        <w:t>accessibility and retained real-provider evidence requirements.</w:t>
+      </w:r>
+    </w:p>
+    <w:p/>
+    <w:p>
+      <w:pPr/>
+      <w:r>
+        <w:rPr>
+          <w:rFonts w:ascii="Helvetica Light" w:hAnsi="Helvetica Light" w:cs="Helvetica Light"/>
+          <w:sz w:val="18"/>
+          <w:szCs w:val="18"/>
+        </w:rPr>
         <w:t>### Controlled component-family contract</w:t>
       </w:r>
     </w:p>
@@ -3655,19 +3810,52 @@
           <w:sz w:val="18"/>
           <w:szCs w:val="18"/>
         </w:rPr>
-        <w:t>### Controlled page-recipe and slot contract</w:t>
-      </w:r>
-    </w:p>
-    <w:p/>
-    <w:p>
-      <w:pPr/>
-      <w:r>
-        <w:rPr>
-          <w:rFonts w:ascii="Helvetica Light" w:hAnsi="Helvetica Light" w:cs="Helvetica Light"/>
-          <w:sz w:val="18"/>
-          <w:szCs w:val="18"/>
-        </w:rPr>
-        <w:t>A page recipe is an approved page-template structure, not a finished fixed theme. It defines:</w:t>
+        <w:t>### Controlled PageBlueprint recipe-profile and slot contract</w:t>
+      </w:r>
+    </w:p>
+    <w:p/>
+    <w:p>
+      <w:pPr/>
+      <w:r>
+        <w:rPr>
+          <w:rFonts w:ascii="Helvetica Light" w:hAnsi="Helvetica Light" w:cs="Helvetica Light"/>
+          <w:sz w:val="18"/>
+          <w:szCs w:val="18"/>
+        </w:rPr>
+        <w:t>A commercial page recipe is a registered, constrained `PageBlueprint` profile or preset, not a</w:t>
+      </w:r>
+    </w:p>
+    <w:p>
+      <w:pPr/>
+      <w:r>
+        <w:rPr>
+          <w:rFonts w:ascii="Helvetica Light" w:hAnsi="Helvetica Light" w:cs="Helvetica Light"/>
+          <w:sz w:val="18"/>
+          <w:szCs w:val="18"/>
+        </w:rPr>
+        <w:t>second page graph, template architecture or independently executable representation. The canonical</w:t>
+      </w:r>
+    </w:p>
+    <w:p>
+      <w:pPr/>
+      <w:r>
+        <w:rPr>
+          <w:rFonts w:ascii="Helvetica Light" w:hAnsi="Helvetica Light" w:cs="Helvetica Light"/>
+          <w:sz w:val="18"/>
+          <w:szCs w:val="18"/>
+        </w:rPr>
+        <w:t>`PageBlueprint` remains the executable page-composition contract. A recipe defines its</w:t>
+      </w:r>
+    </w:p>
+    <w:p>
+      <w:pPr/>
+      <w:r>
+        <w:rPr>
+          <w:rFonts w:ascii="Helvetica Light" w:hAnsi="Helvetica Light" w:cs="Helvetica Light"/>
+          <w:sz w:val="18"/>
+          <w:szCs w:val="18"/>
+        </w:rPr>
+        <w:t>permitted/default values for:</w:t>
       </w:r>
     </w:p>
     <w:p/>
@@ -3712,18 +3900,18 @@
           <w:sz w:val="18"/>
           <w:szCs w:val="18"/>
         </w:rPr>
-        <w:t>- canonical commerce bindings and approved-asset requirements;</w:t>
-      </w:r>
-    </w:p>
-    <w:p>
-      <w:pPr/>
-      <w:r>
-        <w:rPr>
-          <w:rFonts w:ascii="Helvetica Light" w:hAnsi="Helvetica Light" w:cs="Helvetica Light"/>
-          <w:sz w:val="18"/>
-          <w:szCs w:val="18"/>
-        </w:rPr>
-        <w:t>- responsive behavior and shared-frame/cross-page coordination;</w:t>
+        <w:t>- canonical data bindings and approved-asset requirements;</w:t>
+      </w:r>
+    </w:p>
+    <w:p>
+      <w:pPr/>
+      <w:r>
+        <w:rPr>
+          <w:rFonts w:ascii="Helvetica Light" w:hAnsi="Helvetica Light" w:cs="Helvetica Light"/>
+          <w:sz w:val="18"/>
+          <w:szCs w:val="18"/>
+        </w:rPr>
+        <w:t>- responsive constraints and shared-frame/cross-page coordination;</w:t>
       </w:r>
     </w:p>
     <w:p>
@@ -3746,62 +3934,95 @@
           <w:sz w:val="18"/>
           <w:szCs w:val="18"/>
         </w:rPr>
-        <w:t>The AI may select and populate a compatible recipe through structured operations. It MUST NOT</w:t>
-      </w:r>
-    </w:p>
-    <w:p>
-      <w:pPr/>
-      <w:r>
-        <w:rPr>
-          <w:rFonts w:ascii="Helvetica Light" w:hAnsi="Helvetica Light" w:cs="Helvetica Light"/>
-          <w:sz w:val="18"/>
-          <w:szCs w:val="18"/>
-        </w:rPr>
-        <w:t>generate arbitrary component trees, executable code or unregistered slots. A slot is satisfied only</w:t>
-      </w:r>
-    </w:p>
-    <w:p>
-      <w:pPr/>
-      <w:r>
-        <w:rPr>
-          <w:rFonts w:ascii="Helvetica Light" w:hAnsi="Helvetica Light" w:cs="Helvetica Light"/>
-          <w:sz w:val="18"/>
-          <w:szCs w:val="18"/>
-        </w:rPr>
-        <w:t>when its registered cardinality, family/variant compatibility, binding, asset-role and omission rules</w:t>
-      </w:r>
-    </w:p>
-    <w:p>
-      <w:pPr/>
-      <w:r>
-        <w:rPr>
-          <w:rFonts w:ascii="Helvetica Light" w:hAnsi="Helvetica Light" w:cs="Helvetica Light"/>
-          <w:sz w:val="18"/>
-          <w:szCs w:val="18"/>
-        </w:rPr>
-        <w:t>pass validation. Optional evidence or trust slots MUST be omitted when approved merchant evidence is</w:t>
-      </w:r>
-    </w:p>
-    <w:p>
-      <w:pPr/>
-      <w:r>
-        <w:rPr>
-          <w:rFonts w:ascii="Helvetica Light" w:hAnsi="Helvetica Light" w:cs="Helvetica Light"/>
-          <w:sz w:val="18"/>
-          <w:szCs w:val="18"/>
-        </w:rPr>
-        <w:t>unavailable; defaults MUST NOT introduce unsupported delivery, material, durability, guarantee,</w:t>
-      </w:r>
-    </w:p>
-    <w:p>
-      <w:pPr/>
-      <w:r>
-        <w:rPr>
-          <w:rFonts w:ascii="Helvetica Light" w:hAnsi="Helvetica Light" w:cs="Helvetica Light"/>
-          <w:sz w:val="18"/>
-          <w:szCs w:val="18"/>
-        </w:rPr>
-        <w:t>sustainability, popularity, performance or certification claims.</w:t>
+        <w:t>Recipe selection materializes or constrains a canonical `PageBlueprint`. Proposal, compiler,</w:t>
+      </w:r>
+    </w:p>
+    <w:p>
+      <w:pPr/>
+      <w:r>
+        <w:rPr>
+          <w:rFonts w:ascii="Helvetica Light" w:hAnsi="Helvetica Light" w:cs="Helvetica Light"/>
+          <w:sz w:val="18"/>
+          <w:szCs w:val="18"/>
+        </w:rPr>
+        <w:t>snapshot, editor, preview, save, history and publish continue to operate through `PageBlueprint` and</w:t>
+      </w:r>
+    </w:p>
+    <w:p>
+      <w:pPr/>
+      <w:r>
+        <w:rPr>
+          <w:rFonts w:ascii="Helvetica Light" w:hAnsi="Helvetica Light" w:cs="Helvetica Light"/>
+          <w:sz w:val="18"/>
+          <w:szCs w:val="18"/>
+        </w:rPr>
+        <w:t>`StorefrontSnapshot`; there is no recipe engine or separately persisted recipe representation. The</w:t>
+      </w:r>
+    </w:p>
+    <w:p>
+      <w:pPr/>
+      <w:r>
+        <w:rPr>
+          <w:rFonts w:ascii="Helvetica Light" w:hAnsi="Helvetica Light" w:cs="Helvetica Light"/>
+          <w:sz w:val="18"/>
+          <w:szCs w:val="18"/>
+        </w:rPr>
+        <w:t>AI may select and populate a compatible registered profile through structured operations. It MUST</w:t>
+      </w:r>
+    </w:p>
+    <w:p>
+      <w:pPr/>
+      <w:r>
+        <w:rPr>
+          <w:rFonts w:ascii="Helvetica Light" w:hAnsi="Helvetica Light" w:cs="Helvetica Light"/>
+          <w:sz w:val="18"/>
+          <w:szCs w:val="18"/>
+        </w:rPr>
+        <w:t>NOT generate arbitrary component trees, executable code or unregistered slots. A slot is satisfied</w:t>
+      </w:r>
+    </w:p>
+    <w:p>
+      <w:pPr/>
+      <w:r>
+        <w:rPr>
+          <w:rFonts w:ascii="Helvetica Light" w:hAnsi="Helvetica Light" w:cs="Helvetica Light"/>
+          <w:sz w:val="18"/>
+          <w:szCs w:val="18"/>
+        </w:rPr>
+        <w:t>only when its registered cardinality, family/variant compatibility, binding, asset-role and omission</w:t>
+      </w:r>
+    </w:p>
+    <w:p>
+      <w:pPr/>
+      <w:r>
+        <w:rPr>
+          <w:rFonts w:ascii="Helvetica Light" w:hAnsi="Helvetica Light" w:cs="Helvetica Light"/>
+          <w:sz w:val="18"/>
+          <w:szCs w:val="18"/>
+        </w:rPr>
+        <w:t>rules pass validation. Optional evidence or trust slots MUST be omitted when approved merchant</w:t>
+      </w:r>
+    </w:p>
+    <w:p>
+      <w:pPr/>
+      <w:r>
+        <w:rPr>
+          <w:rFonts w:ascii="Helvetica Light" w:hAnsi="Helvetica Light" w:cs="Helvetica Light"/>
+          <w:sz w:val="18"/>
+          <w:szCs w:val="18"/>
+        </w:rPr>
+        <w:t>evidence is unavailable; defaults MUST NOT introduce unsupported delivery, material, durability,</w:t>
+      </w:r>
+    </w:p>
+    <w:p>
+      <w:pPr/>
+      <w:r>
+        <w:rPr>
+          <w:rFonts w:ascii="Helvetica Light" w:hAnsi="Helvetica Light" w:cs="Helvetica Light"/>
+          <w:sz w:val="18"/>
+          <w:szCs w:val="18"/>
+        </w:rPr>
+        <w:t>guarantee, sustainability, popularity, performance or certification claims.</w:t>
       </w:r>
     </w:p>
     <w:p/>
@@ -3825,29 +4046,40 @@
           <w:sz w:val="18"/>
           <w:szCs w:val="18"/>
         </w:rPr>
-        <w:t>Within an approved family/recipe structure, AI may choose only typed, validated parameters: semantic</w:t>
-      </w:r>
-    </w:p>
-    <w:p>
-      <w:pPr/>
-      <w:r>
-        <w:rPr>
-          <w:rFonts w:ascii="Helvetica Light" w:hAnsi="Helvetica Light" w:cs="Helvetica Light"/>
-          <w:sz w:val="18"/>
-          <w:szCs w:val="18"/>
-        </w:rPr>
-        <w:t>palette; typography system, heading scale and weight; spacing/density; radius; border treatment;</w:t>
-      </w:r>
-    </w:p>
-    <w:p>
-      <w:pPr/>
-      <w:r>
-        <w:rPr>
-          <w:rFonts w:ascii="Helvetica Light" w:hAnsi="Helvetica Light" w:cs="Helvetica Light"/>
-          <w:sz w:val="18"/>
-          <w:szCs w:val="18"/>
-        </w:rPr>
-        <w:t>elevation/shadows; image ratio/crop/treatment; overlay strength; button treatment; and card surface.</w:t>
+        <w:t>Within an approved family/PageBlueprint-profile structure, AI may choose only typed, validated</w:t>
+      </w:r>
+    </w:p>
+    <w:p>
+      <w:pPr/>
+      <w:r>
+        <w:rPr>
+          <w:rFonts w:ascii="Helvetica Light" w:hAnsi="Helvetica Light" w:cs="Helvetica Light"/>
+          <w:sz w:val="18"/>
+          <w:szCs w:val="18"/>
+        </w:rPr>
+        <w:t>parameters: semantic palette; typography system, heading scale and weight; spacing/density; radius;</w:t>
+      </w:r>
+    </w:p>
+    <w:p>
+      <w:pPr/>
+      <w:r>
+        <w:rPr>
+          <w:rFonts w:ascii="Helvetica Light" w:hAnsi="Helvetica Light" w:cs="Helvetica Light"/>
+          <w:sz w:val="18"/>
+          <w:szCs w:val="18"/>
+        </w:rPr>
+        <w:t>border treatment; elevation/shadows; image ratio/crop/treatment; overlay strength; button treatment;</w:t>
+      </w:r>
+    </w:p>
+    <w:p>
+      <w:pPr/>
+      <w:r>
+        <w:rPr>
+          <w:rFonts w:ascii="Helvetica Light" w:hAnsi="Helvetica Light" w:cs="Helvetica Light"/>
+          <w:sz w:val="18"/>
+          <w:szCs w:val="18"/>
+        </w:rPr>
+        <w:t>and card surface.</w:t>
       </w:r>
     </w:p>
     <w:p>
@@ -3926,7 +4158,7 @@
           <w:sz w:val="18"/>
           <w:szCs w:val="18"/>
         </w:rPr>
-        <w:t xml:space="preserve">  → coordinated page recipe</w:t>
+        <w:t xml:space="preserve">  → registered PageBlueprint recipe profile</w:t>
       </w:r>
     </w:p>
     <w:p>
@@ -3982,18 +4214,18 @@
           <w:sz w:val="18"/>
           <w:szCs w:val="18"/>
         </w:rPr>
-        <w:t>allowed, typed and compatible with its family and recipe; it must not create an unrelated visual</w:t>
-      </w:r>
-    </w:p>
-    <w:p>
-      <w:pPr/>
-      <w:r>
-        <w:rPr>
-          <w:rFonts w:ascii="Helvetica Light" w:hAnsi="Helvetica Light" w:cs="Helvetica Light"/>
-          <w:sz w:val="18"/>
-          <w:szCs w:val="18"/>
-        </w:rPr>
-        <w:t>language across sections or bypass global accessibility/responsive rules.</w:t>
+        <w:t>allowed, typed and compatible with its family and PageBlueprint profile; it must not create an</w:t>
+      </w:r>
+    </w:p>
+    <w:p>
+      <w:pPr/>
+      <w:r>
+        <w:rPr>
+          <w:rFonts w:ascii="Helvetica Light" w:hAnsi="Helvetica Light" w:cs="Helvetica Light"/>
+          <w:sz w:val="18"/>
+          <w:szCs w:val="18"/>
+        </w:rPr>
+        <w:t>unrelated visual language across sections or bypass global accessibility/responsive rules.</w:t>
       </w:r>
     </w:p>
     <w:p/>
@@ -4028,40 +4260,40 @@
           <w:sz w:val="18"/>
           <w:szCs w:val="18"/>
         </w:rPr>
-        <w:t>distinct variants per applicable family, 3–4 coordinated recipes for each major page type, and</w:t>
-      </w:r>
-    </w:p>
-    <w:p>
-      <w:pPr/>
-      <w:r>
-        <w:rPr>
-          <w:rFonts w:ascii="Helvetica Light" w:hAnsi="Helvetica Light" w:cs="Helvetica Light"/>
-          <w:sz w:val="18"/>
-          <w:szCs w:val="18"/>
-        </w:rPr>
-        <w:t>strong typography, spacing, surface, shape, elevation and image-treatment controls. These are depth</w:t>
-      </w:r>
-    </w:p>
-    <w:p>
-      <w:pPr/>
-      <w:r>
-        <w:rPr>
-          <w:rFonts w:ascii="Helvetica Light" w:hAnsi="Helvetica Light" w:cs="Helvetica Light"/>
-          <w:sz w:val="18"/>
-          <w:szCs w:val="18"/>
-        </w:rPr>
-        <w:t>and quality targets, not registry quotas: a smaller excellent library is preferable to many visually</w:t>
-      </w:r>
-    </w:p>
-    <w:p>
-      <w:pPr/>
-      <w:r>
-        <w:rPr>
-          <w:rFonts w:ascii="Helvetica Light" w:hAnsi="Helvetica Light" w:cs="Helvetica Light"/>
-          <w:sz w:val="18"/>
-          <w:szCs w:val="18"/>
-        </w:rPr>
-        <w:t>equivalent variants.</w:t>
+        <w:t>distinct variants per applicable family, 3–4 coordinated registered PageBlueprint recipe profiles</w:t>
+      </w:r>
+    </w:p>
+    <w:p>
+      <w:pPr/>
+      <w:r>
+        <w:rPr>
+          <w:rFonts w:ascii="Helvetica Light" w:hAnsi="Helvetica Light" w:cs="Helvetica Light"/>
+          <w:sz w:val="18"/>
+          <w:szCs w:val="18"/>
+        </w:rPr>
+        <w:t>for each major page type, and strong typography, spacing, surface, shape, elevation and</w:t>
+      </w:r>
+    </w:p>
+    <w:p>
+      <w:pPr/>
+      <w:r>
+        <w:rPr>
+          <w:rFonts w:ascii="Helvetica Light" w:hAnsi="Helvetica Light" w:cs="Helvetica Light"/>
+          <w:sz w:val="18"/>
+          <w:szCs w:val="18"/>
+        </w:rPr>
+        <w:t>image-treatment controls. These are depth and quality targets, not registry quotas: a smaller</w:t>
+      </w:r>
+    </w:p>
+    <w:p>
+      <w:pPr/>
+      <w:r>
+        <w:rPr>
+          <w:rFonts w:ascii="Helvetica Light" w:hAnsi="Helvetica Light" w:cs="Helvetica Light"/>
+          <w:sz w:val="18"/>
+          <w:szCs w:val="18"/>
+        </w:rPr>
+        <w:t>excellent library is preferable to many visually equivalent variants.</w:t>
       </w:r>
     </w:p>
     <w:p/>
@@ -4106,18 +4338,52 @@
           <w:sz w:val="18"/>
           <w:szCs w:val="18"/>
         </w:rPr>
-        <w:t>Compatibility, recipe constraints, responsive rules, accessibility and cross-page coordination MUST</w:t>
-      </w:r>
-    </w:p>
-    <w:p>
-      <w:pPr/>
-      <w:r>
-        <w:rPr>
-          <w:rFonts w:ascii="Helvetica Light" w:hAnsi="Helvetica Light" w:cs="Helvetica Light"/>
-          <w:sz w:val="18"/>
-          <w:szCs w:val="18"/>
-        </w:rPr>
-        <w:t>filter invalid or low-quality combinations.</w:t>
+        <w:t>Compatibility, PageBlueprint-profile constraints, responsive rules, accessibility and cross-page</w:t>
+      </w:r>
+    </w:p>
+    <w:p>
+      <w:pPr/>
+      <w:r>
+        <w:rPr>
+          <w:rFonts w:ascii="Helvetica Light" w:hAnsi="Helvetica Light" w:cs="Helvetica Light"/>
+          <w:sz w:val="18"/>
+          <w:szCs w:val="18"/>
+        </w:rPr>
+        <w:t>coordination MUST filter invalid or low-quality combinations.</w:t>
+      </w:r>
+    </w:p>
+    <w:p/>
+    <w:p>
+      <w:pPr/>
+      <w:r>
+        <w:rPr>
+          <w:rFonts w:ascii="Helvetica Light" w:hAnsi="Helvetica Light" w:cs="Helvetica Light"/>
+          <w:sz w:val="18"/>
+          <w:szCs w:val="18"/>
+        </w:rPr>
+        <w:t>P10A Task 8 implements the coordinated commercial recipes only as registered constrained</w:t>
+      </w:r>
+    </w:p>
+    <w:p>
+      <w:pPr/>
+      <w:r>
+        <w:rPr>
+          <w:rFonts w:ascii="Helvetica Light" w:hAnsi="Helvetica Light" w:cs="Helvetica Light"/>
+          <w:sz w:val="18"/>
+          <w:szCs w:val="18"/>
+        </w:rPr>
+        <w:t>`PageBlueprint` profiles. P10A-03 remains the canonical implementation contract and MUST NOT</w:t>
+      </w:r>
+    </w:p>
+    <w:p>
+      <w:pPr/>
+      <w:r>
+        <w:rPr>
+          <w:rFonts w:ascii="Helvetica Light" w:hAnsi="Helvetica Light" w:cs="Helvetica Light"/>
+          <w:sz w:val="18"/>
+          <w:szCs w:val="18"/>
+        </w:rPr>
+        <w:t>duplicate or synchronize a separate recipe/template representation.</w:t>
       </w:r>
     </w:p>
     <w:p/>
@@ -4781,29 +5047,29 @@
           <w:sz w:val="18"/>
           <w:szCs w:val="18"/>
         </w:rPr>
-        <w:t>| **FR-120** | Each page recipe MUST define required/optional slots, permitted ordering, compatible families/variants, responsive behavior, commerce bindings, approved-asset requirements, cross-page coordination and omission/fallback rules. |</w:t>
-      </w:r>
-    </w:p>
-    <w:p>
-      <w:pPr/>
-      <w:r>
-        <w:rPr>
-          <w:rFonts w:ascii="Helvetica Light" w:hAnsi="Helvetica Light" w:cs="Helvetica Light"/>
-          <w:sz w:val="18"/>
-          <w:szCs w:val="18"/>
-        </w:rPr>
-        <w:t>| **FR-121** | AI composition MUST select only registered recipes, compatible variants, permitted ordering and typed bounded design parameters; it MUST NOT emit arbitrary trees, CSS, class names, executable code, font imports or unregistered layout values. |</w:t>
-      </w:r>
-    </w:p>
-    <w:p>
-      <w:pPr/>
-      <w:r>
-        <w:rPr>
-          <w:rFonts w:ascii="Helvetica Light" w:hAnsi="Helvetica Light" w:cs="Helvetica Light"/>
-          <w:sz w:val="18"/>
-          <w:szCs w:val="18"/>
-        </w:rPr>
-        <w:t>| **FR-122** | Design inheritance MUST flow from `BrandSystem` through recipe and family/variant to constrained validated instance overrides; local overrides MUST NOT create unrelated visual languages. |</w:t>
+        <w:t>| **FR-120** | Each commercial recipe MUST be a registered constrained `PageBlueprint` profile that defines required/optional slots, compatible families/variants, default and permitted ordering, data bindings, approved-asset requirements, responsive constraints, omission/fallback rules and cross-page coordination without a second executable representation. |</w:t>
+      </w:r>
+    </w:p>
+    <w:p>
+      <w:pPr/>
+      <w:r>
+        <w:rPr>
+          <w:rFonts w:ascii="Helvetica Light" w:hAnsi="Helvetica Light" w:cs="Helvetica Light"/>
+          <w:sz w:val="18"/>
+          <w:szCs w:val="18"/>
+        </w:rPr>
+        <w:t>| **FR-121** | AI composition MUST select only registered PageBlueprint recipe profiles, compatible registered families/variants, permitted ordering and typed bounded design parameters; proposals and PageBlueprints MUST reject arbitrary trees, raw CSS, arbitrary class names, executable JavaScript/React or generated code, unrestricted font imports and layout/style values outside registered bounds. |</w:t>
+      </w:r>
+    </w:p>
+    <w:p>
+      <w:pPr/>
+      <w:r>
+        <w:rPr>
+          <w:rFonts w:ascii="Helvetica Light" w:hAnsi="Helvetica Light" w:cs="Helvetica Light"/>
+          <w:sz w:val="18"/>
+          <w:szCs w:val="18"/>
+        </w:rPr>
+        <w:t>| **FR-122** | Design inheritance MUST flow from `BrandSystem` through a registered PageBlueprint recipe profile and family/variant to constrained validated instance overrides; semantic tokens normally flow downward, renderer-visible values remain derived from canonical typed state, and invalid or unrelated local visual-language overrides MUST fail validation. |</w:t>
       </w:r>
     </w:p>
     <w:p>
@@ -6079,29 +6345,51 @@
           <w:sz w:val="18"/>
           <w:szCs w:val="18"/>
         </w:rPr>
-        <w:t>The v1.2.1 roadmap starts from repository commit</w:t>
-      </w:r>
-    </w:p>
-    <w:p>
-      <w:pPr/>
-      <w:r>
-        <w:rPr>
-          <w:rFonts w:ascii="Helvetica Light" w:hAnsi="Helvetica Light" w:cs="Helvetica Light"/>
-          <w:sz w:val="18"/>
-          <w:szCs w:val="18"/>
-        </w:rPr>
-        <w:t>`8174b1a6d31301b4072622e2e3ef675957479121` on 30 July 2026, not from the original</w:t>
-      </w:r>
-    </w:p>
-    <w:p>
-      <w:pPr/>
-      <w:r>
-        <w:rPr>
-          <w:rFonts w:ascii="Helvetica Light" w:hAnsi="Helvetica Light" w:cs="Helvetica Light"/>
-          <w:sz w:val="18"/>
-          <w:szCs w:val="18"/>
-        </w:rPr>
-        <w:t>phase list in v1.1. “Verified” is limited to retained repository evidence.</w:t>
+        <w:t>The v1.2.2 amendment starts from repository commit</w:t>
+      </w:r>
+    </w:p>
+    <w:p>
+      <w:pPr/>
+      <w:r>
+        <w:rPr>
+          <w:rFonts w:ascii="Helvetica Light" w:hAnsi="Helvetica Light" w:cs="Helvetica Light"/>
+          <w:sz w:val="18"/>
+          <w:szCs w:val="18"/>
+        </w:rPr>
+        <w:t>`4a96a5a5567b83e62306f73f7069e0e09f0c8683` on 31 July 2026, which includes the P9R-06</w:t>
+      </w:r>
+    </w:p>
+    <w:p>
+      <w:pPr/>
+      <w:r>
+        <w:rPr>
+          <w:rFonts w:ascii="Helvetica Light" w:hAnsi="Helvetica Light" w:cs="Helvetica Light"/>
+          <w:sz w:val="18"/>
+          <w:szCs w:val="18"/>
+        </w:rPr>
+        <w:t>homepage-routing merge. The earlier v1.2.1 baseline remains</w:t>
+      </w:r>
+    </w:p>
+    <w:p>
+      <w:pPr/>
+      <w:r>
+        <w:rPr>
+          <w:rFonts w:ascii="Helvetica Light" w:hAnsi="Helvetica Light" w:cs="Helvetica Light"/>
+          <w:sz w:val="18"/>
+          <w:szCs w:val="18"/>
+        </w:rPr>
+        <w:t>`8174b1a6d31301b4072622e2e3ef675957479121` on 30 July 2026. Neither baseline revives the original</w:t>
+      </w:r>
+    </w:p>
+    <w:p>
+      <w:pPr/>
+      <w:r>
+        <w:rPr>
+          <w:rFonts w:ascii="Helvetica Light" w:hAnsi="Helvetica Light" w:cs="Helvetica Light"/>
+          <w:sz w:val="18"/>
+          <w:szCs w:val="18"/>
+        </w:rPr>
+        <w:t>phase list in v1.1, and “Verified” is limited to retained repository evidence.</w:t>
       </w:r>
     </w:p>
     <w:p/>
@@ -16288,29 +16576,29 @@
           <w:sz w:val="18"/>
           <w:szCs w:val="18"/>
         </w:rPr>
-        <w:t>| **AC-136** | A selected commercial recipe permits only its registered required/optional slots, compatible meaningful variants, bindings, approved assets and controlled ordering; invalid combinations fail before proposal acceptance. | FR-119, FR-120, FR-121, FR-123, NFR-101, NFR-109 |</w:t>
-      </w:r>
-    </w:p>
-    <w:p>
-      <w:pPr/>
-      <w:r>
-        <w:rPr>
-          <w:rFonts w:ascii="Helvetica Light" w:hAnsi="Helvetica Light" w:cs="Helvetica Light"/>
-          <w:sz w:val="18"/>
-          <w:szCs w:val="18"/>
-        </w:rPr>
-        <w:t>| **AC-137** | Every supported commercial capability is proved through registered → planner-selectable → proposal-expressible → compiler-preserved → StorefrontSnapshot-stored → renderer-visible → editor-editable → manually live-proven. | FR-119, FR-124, NFR-108, NFR-109 |</w:t>
-      </w:r>
-    </w:p>
-    <w:p>
-      <w:pPr/>
-      <w:r>
-        <w:rPr>
-          <w:rFonts w:ascii="Helvetica Light" w:hAnsi="Helvetica Light" w:cs="Helvetica Light"/>
-          <w:sz w:val="18"/>
-          <w:szCs w:val="18"/>
-        </w:rPr>
-        <w:t>| **AC-138** | Screenshot-level review at 375, 768, 1024 and 1440 px proves a homepage, collection and PDP as one coordinated storefront using representative approved assets; placeholder-only, deterministic-only or schema-only evidence fails. | FR-114, FR-124, NFR-102, NFR-103, NFR-110 |</w:t>
+        <w:t>| **AC-136** | Proposal and PageBlueprint validation accept only registered PageBlueprint recipe profiles, registered compatible families/variants, permitted slots/order/bindings/assets and typed parameters within registered bounds; they reject arbitrary trees, raw CSS, arbitrary class names, executable JavaScript/React or generated code, unrestricted font imports and out-of-contract layout/style values before proposal acceptance. | FR-119, FR-120, FR-121, NFR-101, NFR-109 |</w:t>
+      </w:r>
+    </w:p>
+    <w:p>
+      <w:pPr/>
+      <w:r>
+        <w:rPr>
+          <w:rFonts w:ascii="Helvetica Light" w:hAnsi="Helvetica Light" w:cs="Helvetica Light"/>
+          <w:sz w:val="18"/>
+          <w:szCs w:val="18"/>
+        </w:rPr>
+        <w:t>| **AC-137** | Validation and renderer proof enforce `BrandSystem → registered PageBlueprint recipe profile → component family/variant → constrained instance override`: semantic tokens flow downward, invalid or unrelated local visual-language overrides fail, renderer-visible values derive from canonical typed state, and every supported capability is proved registered → planner-selectable → proposal-expressible → compiler-preserved → StorefrontSnapshot-stored → renderer-visible → editor-editable → manually live-proven. | FR-119, FR-122, FR-124, NFR-101, NFR-108, NFR-109 |</w:t>
+      </w:r>
+    </w:p>
+    <w:p>
+      <w:pPr/>
+      <w:r>
+        <w:rPr>
+          <w:rFonts w:ascii="Helvetica Light" w:hAnsi="Helvetica Light" w:cs="Helvetica Light"/>
+          <w:sz w:val="18"/>
+          <w:szCs w:val="18"/>
+        </w:rPr>
+        <w:t>| **AC-138** | Without approved merchant evidence, optional trust/evidence sections are omitted; registry defaults cannot introduce unsupported delivery, materials, durability, guarantees, sustainability, popularity, performance or certification claims; approved evidence provenance is preserved; and screenshot-level review at 375, 768, 1024 and 1440 px proves homepage, collection and PDP as one coordinated storefront using representative approved assets. Placeholder-only, deterministic-only or schema-only evidence fails. | FR-114, FR-123, FR-124, NFR-101, NFR-102, NFR-103, NFR-110 |</w:t>
       </w:r>
     </w:p>
     <w:p/>
@@ -16412,29 +16700,29 @@
           <w:sz w:val="18"/>
           <w:szCs w:val="18"/>
         </w:rPr>
-        <w:t>gallery, information hierarchy and option/variant presentation. Homepage, collection and PDP</w:t>
-      </w:r>
-    </w:p>
-    <w:p>
-      <w:pPr/>
-      <w:r>
-        <w:rPr>
-          <w:rFonts w:ascii="Helvetica Light" w:hAnsi="Helvetica Light" w:cs="Helvetica Light"/>
-          <w:sz w:val="18"/>
-          <w:szCs w:val="18"/>
-        </w:rPr>
-        <w:t>must share the selected registered recipe/token identity. Colour-only, typography-only and</w:t>
-      </w:r>
-    </w:p>
-    <w:p>
-      <w:pPr/>
-      <w:r>
-        <w:rPr>
-          <w:rFonts w:ascii="Helvetica Light" w:hAnsi="Helvetica Light" w:cs="Helvetica Light"/>
-          <w:sz w:val="18"/>
-          <w:szCs w:val="18"/>
-        </w:rPr>
-        <w:t>one-section-only changes fail, as do mixed-direction pages.</w:t>
+        <w:t>gallery, information hierarchy and option/variant presentation. Homepage, collection and PDP must</w:t>
+      </w:r>
+    </w:p>
+    <w:p>
+      <w:pPr/>
+      <w:r>
+        <w:rPr>
+          <w:rFonts w:ascii="Helvetica Light" w:hAnsi="Helvetica Light" w:cs="Helvetica Light"/>
+          <w:sz w:val="18"/>
+          <w:szCs w:val="18"/>
+        </w:rPr>
+        <w:t>share the selected registered PageBlueprint recipe-profile/token identity. Colour-only,</w:t>
+      </w:r>
+    </w:p>
+    <w:p>
+      <w:pPr/>
+      <w:r>
+        <w:rPr>
+          <w:rFonts w:ascii="Helvetica Light" w:hAnsi="Helvetica Light" w:cs="Helvetica Light"/>
+          <w:sz w:val="18"/>
+          <w:szCs w:val="18"/>
+        </w:rPr>
+        <w:t>typography-only and one-section-only changes fail, as do mixed-direction pages.</w:t>
       </w:r>
     </w:p>
     <w:p/>
@@ -18726,29 +19014,29 @@
           <w:sz w:val="18"/>
           <w:szCs w:val="18"/>
         </w:rPr>
-        <w:t>| Controlled page recipe        | Approved page-template structure with required/optional slots, compatible families/variants, controlled order, bindings, assets, responsive coordination and omission rules; it is not a fixed theme or second page tree. |</w:t>
-      </w:r>
-    </w:p>
-    <w:p>
-      <w:pPr/>
-      <w:r>
-        <w:rPr>
-          <w:rFonts w:ascii="Helvetica Light" w:hAnsi="Helvetica Light" w:cs="Helvetica Light"/>
-          <w:sz w:val="18"/>
-          <w:szCs w:val="18"/>
-        </w:rPr>
-        <w:t>| Bounded parametric design     | Typed validated selection of approved visual parameters inside a registered recipe/family; the renderer, not AI output, converts them to CSS. |</w:t>
-      </w:r>
-    </w:p>
-    <w:p>
-      <w:pPr/>
-      <w:r>
-        <w:rPr>
-          <w:rFonts w:ascii="Helvetica Light" w:hAnsi="Helvetica Light" w:cs="Helvetica Light"/>
-          <w:sz w:val="18"/>
-          <w:szCs w:val="18"/>
-        </w:rPr>
-        <w:t>| Page blueprint                | Approved page-level composition rules that select compatible component families and required bindings.                               |</w:t>
+        <w:t>| Controlled page recipe        | Registered constrained profile or preset of permitted/default canonical PageBlueprint values for slots, compatible families/variants, order, bindings, assets, responsive constraints, coordination and omission/fallback rules; it is never a second page graph or executable representation. |</w:t>
+      </w:r>
+    </w:p>
+    <w:p>
+      <w:pPr/>
+      <w:r>
+        <w:rPr>
+          <w:rFonts w:ascii="Helvetica Light" w:hAnsi="Helvetica Light" w:cs="Helvetica Light"/>
+          <w:sz w:val="18"/>
+          <w:szCs w:val="18"/>
+        </w:rPr>
+        <w:t>| Bounded parametric design     | Typed validated selection of approved visual parameters inside a registered PageBlueprint profile/family; the renderer, not AI output, converts them to CSS. |</w:t>
+      </w:r>
+    </w:p>
+    <w:p>
+      <w:pPr/>
+      <w:r>
+        <w:rPr>
+          <w:rFonts w:ascii="Helvetica Light" w:hAnsi="Helvetica Light" w:cs="Helvetica Light"/>
+          <w:sz w:val="18"/>
+          <w:szCs w:val="18"/>
+        </w:rPr>
+        <w:t>| Page blueprint                | Canonical executable page-composition contract; recipe selection only materializes or constrains this contract before compilation to StorefrontSnapshot. |</w:t>
       </w:r>
     </w:p>
     <w:p>

</xml_diff>

<commit_message>
fix: close design vocabulary contract gaps
</commit_message>
<xml_diff>
--- a/docs/VESKIFY_SDD_v1.2.2.docx
+++ b/docs/VESKIFY_SDD_v1.2.2.docx
@@ -4226,6 +4226,574 @@
           <w:szCs w:val="18"/>
         </w:rPr>
         <w:t>unrelated visual language across sections or bypass global accessibility/responsive rules.</w:t>
+      </w:r>
+    </w:p>
+    <w:p/>
+    <w:p>
+      <w:pPr/>
+      <w:r>
+        <w:rPr>
+          <w:rFonts w:ascii="Helvetica Light" w:hAnsi="Helvetica Light" w:cs="Helvetica Light"/>
+          <w:sz w:val="18"/>
+          <w:szCs w:val="18"/>
+        </w:rPr>
+        <w:t>### P10A Task 6 narrative vocabulary and deterministic composition validation</w:t>
+      </w:r>
+    </w:p>
+    <w:p/>
+    <w:p>
+      <w:pPr/>
+      <w:r>
+        <w:rPr>
+          <w:rFonts w:ascii="Helvetica Light" w:hAnsi="Helvetica Light" w:cs="Helvetica Light"/>
+          <w:sz w:val="18"/>
+          <w:szCs w:val="18"/>
+        </w:rPr>
+        <w:t>Task 6 formalizes the controlled middle layer without creating a second page graph, planner,</w:t>
+      </w:r>
+    </w:p>
+    <w:p>
+      <w:pPr/>
+      <w:r>
+        <w:rPr>
+          <w:rFonts w:ascii="Helvetica Light" w:hAnsi="Helvetica Light" w:cs="Helvetica Light"/>
+          <w:sz w:val="18"/>
+          <w:szCs w:val="18"/>
+        </w:rPr>
+        <w:t>snapshot, proposal representation or component registry. `PageBlueprint` precursor plans carry</w:t>
+      </w:r>
+    </w:p>
+    <w:p>
+      <w:pPr/>
+      <w:r>
+        <w:rPr>
+          <w:rFonts w:ascii="Helvetica Light" w:hAnsi="Helvetica Light" w:cs="Helvetica Light"/>
+          <w:sz w:val="18"/>
+          <w:szCs w:val="18"/>
+        </w:rPr>
+        <w:t>registered narrative metadata and continue to materialize only canonical page sections. The</w:t>
+      </w:r>
+    </w:p>
+    <w:p>
+      <w:pPr/>
+      <w:r>
+        <w:rPr>
+          <w:rFonts w:ascii="Helvetica Light" w:hAnsi="Helvetica Light" w:cs="Helvetica Light"/>
+          <w:sz w:val="18"/>
+          <w:szCs w:val="18"/>
+        </w:rPr>
+        <w:t>controlled narrative roles are `orientation`, `primary-discovery`, `secondary-discovery`,</w:t>
+      </w:r>
+    </w:p>
+    <w:p>
+      <w:pPr/>
+      <w:r>
+        <w:rPr>
+          <w:rFonts w:ascii="Helvetica Light" w:hAnsi="Helvetica Light" w:cs="Helvetica Light"/>
+          <w:sz w:val="18"/>
+          <w:szCs w:val="18"/>
+        </w:rPr>
+        <w:t>`product-focus`, `product-proof`, `brand-story`, `brand-proof`, `education`, `campaign`, `trust`,</w:t>
+      </w:r>
+    </w:p>
+    <w:p>
+      <w:pPr/>
+      <w:r>
+        <w:rPr>
+          <w:rFonts w:ascii="Helvetica Light" w:hAnsi="Helvetica Light" w:cs="Helvetica Light"/>
+          <w:sz w:val="18"/>
+          <w:szCs w:val="18"/>
+        </w:rPr>
+        <w:t>`service`, `conversion` and `continuation`. They are exact registered IDs, never model-provided</w:t>
+      </w:r>
+    </w:p>
+    <w:p>
+      <w:pPr/>
+      <w:r>
+        <w:rPr>
+          <w:rFonts w:ascii="Helvetica Light" w:hAnsi="Helvetica Light" w:cs="Helvetica Light"/>
+          <w:sz w:val="18"/>
+          <w:szCs w:val="18"/>
+        </w:rPr>
+        <w:t>free text. Each role declares page applicability, bounded visual weight, cardinality, opening and</w:t>
+      </w:r>
+    </w:p>
+    <w:p>
+      <w:pPr/>
+      <w:r>
+        <w:rPr>
+          <w:rFonts w:ascii="Helvetica Light" w:hAnsi="Helvetica Light" w:cs="Helvetica Light"/>
+          <w:sz w:val="18"/>
+          <w:szCs w:val="18"/>
+        </w:rPr>
+        <w:t>closing eligibility, compatible component families, commerce requirements and accessibility intent.</w:t>
+      </w:r>
+    </w:p>
+    <w:p/>
+    <w:p>
+      <w:pPr/>
+      <w:r>
+        <w:rPr>
+          <w:rFonts w:ascii="Helvetica Light" w:hAnsi="Helvetica Light" w:cs="Helvetica Light"/>
+          <w:sz w:val="18"/>
+          <w:szCs w:val="18"/>
+        </w:rPr>
+        <w:t>Visual weight is one of `light`, `medium`, `heavy` or `dominant`. Registered flow rules can require,</w:t>
+      </w:r>
+    </w:p>
+    <w:p>
+      <w:pPr/>
+      <w:r>
+        <w:rPr>
+          <w:rFonts w:ascii="Helvetica Light" w:hAnsi="Helvetica Light" w:cs="Helvetica Light"/>
+          <w:sz w:val="18"/>
+          <w:szCs w:val="18"/>
+        </w:rPr>
+        <w:t>prefer or prohibit adjacency; constrain opening/closing roles and role order; require protected</w:t>
+      </w:r>
+    </w:p>
+    <w:p>
+      <w:pPr/>
+      <w:r>
+        <w:rPr>
+          <w:rFonts w:ascii="Helvetica Light" w:hAnsi="Helvetica Light" w:cs="Helvetica Light"/>
+          <w:sz w:val="18"/>
+          <w:szCs w:val="18"/>
+        </w:rPr>
+        <w:t>product context adjacent to conversion; bound repeated roles/families; and prohibit invalid</w:t>
+      </w:r>
+    </w:p>
+    <w:p>
+      <w:pPr/>
+      <w:r>
+        <w:rPr>
+          <w:rFonts w:ascii="Helvetica Light" w:hAnsi="Helvetica Light" w:cs="Helvetica Light"/>
+          <w:sz w:val="18"/>
+          <w:szCs w:val="18"/>
+        </w:rPr>
+        <w:t>weight transitions, including adjacent dominant sections. Adjacent sections may declare only the</w:t>
+      </w:r>
+    </w:p>
+    <w:p>
+      <w:pPr/>
+      <w:r>
+        <w:rPr>
+          <w:rFonts w:ascii="Helvetica Light" w:hAnsi="Helvetica Light" w:cs="Helvetica Light"/>
+          <w:sz w:val="18"/>
+          <w:szCs w:val="18"/>
+        </w:rPr>
+        <w:t>registered narrative transition intents `continuation`, `contrast`, `escalation`, `proof`,</w:t>
+      </w:r>
+    </w:p>
+    <w:p>
+      <w:pPr/>
+      <w:r>
+        <w:rPr>
+          <w:rFonts w:ascii="Helvetica Light" w:hAnsi="Helvetica Light" w:cs="Helvetica Light"/>
+          <w:sz w:val="18"/>
+          <w:szCs w:val="18"/>
+        </w:rPr>
+        <w:t>`clarification`, `conversion` and `reset`; these describe composition, not animation or CSS.</w:t>
+      </w:r>
+    </w:p>
+    <w:p/>
+    <w:p>
+      <w:pPr/>
+      <w:r>
+        <w:rPr>
+          <w:rFonts w:ascii="Helvetica Light" w:hAnsi="Helvetica Light" w:cs="Helvetica Light"/>
+          <w:sz w:val="18"/>
+          <w:szCs w:val="18"/>
+        </w:rPr>
+        <w:t>The bounded parameter vocabulary separates structural values (layout model, registered order,</w:t>
+      </w:r>
+    </w:p>
+    <w:p>
+      <w:pPr/>
+      <w:r>
+        <w:rPr>
+          <w:rFonts w:ascii="Helvetica Light" w:hAnsi="Helvetica Light" w:cs="Helvetica Light"/>
+          <w:sz w:val="18"/>
+          <w:szCs w:val="18"/>
+        </w:rPr>
+        <w:t>columns, media/alignment/information/filter/gallery placement, width, cardinality and responsive</w:t>
+      </w:r>
+    </w:p>
+    <w:p>
+      <w:pPr/>
+      <w:r>
+        <w:rPr>
+          <w:rFonts w:ascii="Helvetica Light" w:hAnsi="Helvetica Light" w:cs="Helvetica Light"/>
+          <w:sz w:val="18"/>
+          <w:szCs w:val="18"/>
+        </w:rPr>
+        <w:t>collapse) from visual values (density, surface, weight, typography role, image/border/shape,</w:t>
+      </w:r>
+    </w:p>
+    <w:p>
+      <w:pPr/>
+      <w:r>
+        <w:rPr>
+          <w:rFonts w:ascii="Helvetica Light" w:hAnsi="Helvetica Light" w:cs="Helvetica Light"/>
+          <w:sz w:val="18"/>
+          <w:szCs w:val="18"/>
+        </w:rPr>
+        <w:t>spacing, emphasis, background role and tone). Values are enums or registered numeric ranges. They</w:t>
+      </w:r>
+    </w:p>
+    <w:p>
+      <w:pPr/>
+      <w:r>
+        <w:rPr>
+          <w:rFonts w:ascii="Helvetica Light" w:hAnsi="Helvetica Light" w:cs="Helvetica Light"/>
+          <w:sz w:val="18"/>
+          <w:szCs w:val="18"/>
+        </w:rPr>
+        <w:t>reuse `BrandSystem` semantics and component-prop vocabulary; they do not permit arbitrary CSS,</w:t>
+      </w:r>
+    </w:p>
+    <w:p>
+      <w:pPr/>
+      <w:r>
+        <w:rPr>
+          <w:rFonts w:ascii="Helvetica Light" w:hAnsi="Helvetica Light" w:cs="Helvetica Light"/>
+          <w:sz w:val="18"/>
+          <w:szCs w:val="18"/>
+        </w:rPr>
+        <w:t>classes, fonts or raw style values. Parameter authority resolves deterministically as</w:t>
+      </w:r>
+    </w:p>
+    <w:p>
+      <w:pPr/>
+      <w:r>
+        <w:rPr>
+          <w:rFonts w:ascii="Helvetica Light" w:hAnsi="Helvetica Light" w:cs="Helvetica Light"/>
+          <w:sz w:val="18"/>
+          <w:szCs w:val="18"/>
+        </w:rPr>
+        <w:t>`BrandSystem → PageBlueprint profile → component variant → instance`. A lower level may only narrow</w:t>
+      </w:r>
+    </w:p>
+    <w:p>
+      <w:pPr/>
+      <w:r>
+        <w:rPr>
+          <w:rFonts w:ascii="Helvetica Light" w:hAnsi="Helvetica Light" w:cs="Helvetica Light"/>
+          <w:sz w:val="18"/>
+          <w:szCs w:val="18"/>
+        </w:rPr>
+        <w:t>an inherited enum set or numeric minimum/maximum and may override only when that registered</w:t>
+      </w:r>
+    </w:p>
+    <w:p>
+      <w:pPr/>
+      <w:r>
+        <w:rPr>
+          <w:rFonts w:ascii="Helvetica Light" w:hAnsi="Helvetica Light" w:cs="Helvetica Light"/>
+          <w:sz w:val="18"/>
+          <w:szCs w:val="18"/>
+        </w:rPr>
+        <w:t>parameter permits it. The effective numeric range is accumulated at every authority level; a later</w:t>
+      </w:r>
+    </w:p>
+    <w:p>
+      <w:pPr/>
+      <w:r>
+        <w:rPr>
+          <w:rFonts w:ascii="Helvetica Light" w:hAnsi="Helvetica Light" w:cs="Helvetica Light"/>
+          <w:sz w:val="18"/>
+          <w:szCs w:val="18"/>
+        </w:rPr>
+        <w:t>value outside it, a restored broader range, contradictory bounds, ambiguous last-write-wins</w:t>
+      </w:r>
+    </w:p>
+    <w:p>
+      <w:pPr/>
+      <w:r>
+        <w:rPr>
+          <w:rFonts w:ascii="Helvetica Light" w:hAnsi="Helvetica Light" w:cs="Helvetica Light"/>
+          <w:sz w:val="18"/>
+          <w:szCs w:val="18"/>
+        </w:rPr>
+        <w:t>resolution and prohibited instance overrides fail with stable typed errors. An explicit empty</w:t>
+      </w:r>
+    </w:p>
+    <w:p>
+      <w:pPr/>
+      <w:r>
+        <w:rPr>
+          <w:rFonts w:ascii="Helvetica Light" w:hAnsi="Helvetica Light" w:cs="Helvetica Light"/>
+          <w:sz w:val="18"/>
+          <w:szCs w:val="18"/>
+        </w:rPr>
+        <w:t>component parameter allowlist permits no bounded parameters; legacy broad compatibility is an</w:t>
+      </w:r>
+    </w:p>
+    <w:p>
+      <w:pPr/>
+      <w:r>
+        <w:rPr>
+          <w:rFonts w:ascii="Helvetica Light" w:hAnsi="Helvetica Light" w:cs="Helvetica Light"/>
+          <w:sz w:val="18"/>
+          <w:szCs w:val="18"/>
+        </w:rPr>
+        <w:t>explicit adapter contract, never an empty-list fallback.</w:t>
+      </w:r>
+    </w:p>
+    <w:p/>
+    <w:p>
+      <w:pPr/>
+      <w:r>
+        <w:rPr>
+          <w:rFonts w:ascii="Helvetica Light" w:hAnsi="Helvetica Light" w:cs="Helvetica Light"/>
+          <w:sz w:val="18"/>
+          <w:szCs w:val="18"/>
+        </w:rPr>
+        <w:t>`ComponentDefinitionV2` declares narrative, weight, transition, parameter, PageBlueprint-profile</w:t>
+      </w:r>
+    </w:p>
+    <w:p>
+      <w:pPr/>
+      <w:r>
+        <w:rPr>
+          <w:rFonts w:ascii="Helvetica Light" w:hAnsi="Helvetica Light" w:cs="Helvetica Light"/>
+          <w:sz w:val="18"/>
+          <w:szCs w:val="18"/>
+        </w:rPr>
+        <w:t>and commerce compatibility. Legacy registered components receive a deterministic broad compatibility</w:t>
+      </w:r>
+    </w:p>
+    <w:p>
+      <w:pPr/>
+      <w:r>
+        <w:rPr>
+          <w:rFonts w:ascii="Helvetica Light" w:hAnsi="Helvetica Light" w:cs="Helvetica Light"/>
+          <w:sz w:val="18"/>
+          <w:szCs w:val="18"/>
+        </w:rPr>
+        <w:t>adapter until Task 7 adds family-specific commercial metadata; this preserves existing Phase 9</w:t>
+      </w:r>
+    </w:p>
+    <w:p>
+      <w:pPr/>
+      <w:r>
+        <w:rPr>
+          <w:rFonts w:ascii="Helvetica Light" w:hAnsi="Helvetica Light" w:cs="Helvetica Light"/>
+          <w:sz w:val="18"/>
+          <w:szCs w:val="18"/>
+        </w:rPr>
+        <w:t>snapshots and proposals. PageBlueprint plans declare allowed/required roles, flow-rule IDs,</w:t>
+      </w:r>
+    </w:p>
+    <w:p>
+      <w:pPr/>
+      <w:r>
+        <w:rPr>
+          <w:rFonts w:ascii="Helvetica Light" w:hAnsi="Helvetica Light" w:cs="Helvetica Light"/>
+          <w:sz w:val="18"/>
+          <w:szCs w:val="18"/>
+        </w:rPr>
+        <w:t>cardinality, bounded-parameter and responsive constraints while retaining their existing slot,</w:t>
+      </w:r>
+    </w:p>
+    <w:p>
+      <w:pPr/>
+      <w:r>
+        <w:rPr>
+          <w:rFonts w:ascii="Helvetica Light" w:hAnsi="Helvetica Light" w:cs="Helvetica Light"/>
+          <w:sz w:val="18"/>
+          <w:szCs w:val="18"/>
+        </w:rPr>
+        <w:t>family/variant, binding and omission rules. Task 6 supplies contracts and deterministic validation</w:t>
+      </w:r>
+    </w:p>
+    <w:p>
+      <w:pPr/>
+      <w:r>
+        <w:rPr>
+          <w:rFonts w:ascii="Helvetica Light" w:hAnsi="Helvetica Light" w:cs="Helvetica Light"/>
+          <w:sz w:val="18"/>
+          <w:szCs w:val="18"/>
+        </w:rPr>
+        <w:t>only. Task 7 supplies commercial families/variants, Task 8 supplies executable constrained</w:t>
+      </w:r>
+    </w:p>
+    <w:p>
+      <w:pPr/>
+      <w:r>
+        <w:rPr>
+          <w:rFonts w:ascii="Helvetica Light" w:hAnsi="Helvetica Light" w:cs="Helvetica Light"/>
+          <w:sz w:val="18"/>
+          <w:szCs w:val="18"/>
+        </w:rPr>
+        <w:t>PageBlueprint profiles, and Task 9 supplies AI selection plus commercial visual-quality and</w:t>
+      </w:r>
+    </w:p>
+    <w:p>
+      <w:pPr/>
+      <w:r>
+        <w:rPr>
+          <w:rFonts w:ascii="Helvetica Light" w:hAnsi="Helvetica Light" w:cs="Helvetica Light"/>
+          <w:sz w:val="18"/>
+          <w:szCs w:val="18"/>
+        </w:rPr>
+        <w:t>full-chain evidence. Task 6 alone does not claim commercially strong storefront output.</w:t>
+      </w:r>
+    </w:p>
+    <w:p/>
+    <w:p>
+      <w:pPr/>
+      <w:r>
+        <w:rPr>
+          <w:rFonts w:ascii="Helvetica Light" w:hAnsi="Helvetica Light" w:cs="Helvetica Light"/>
+          <w:sz w:val="18"/>
+          <w:szCs w:val="18"/>
+        </w:rPr>
+        <w:t>Every referenced flow rule must be registered for the page type; unknown or incompatible rule IDs</w:t>
+      </w:r>
+    </w:p>
+    <w:p>
+      <w:pPr/>
+      <w:r>
+        <w:rPr>
+          <w:rFonts w:ascii="Helvetica Light" w:hAnsi="Helvetica Light" w:cs="Helvetica Light"/>
+          <w:sz w:val="18"/>
+          <w:szCs w:val="18"/>
+        </w:rPr>
+        <w:t>fail closed. A section satisfies both its role's visual-weight allowance and its component</w:t>
+      </w:r>
+    </w:p>
+    <w:p>
+      <w:pPr/>
+      <w:r>
+        <w:rPr>
+          <w:rFonts w:ascii="Helvetica Light" w:hAnsi="Helvetica Light" w:cs="Helvetica Light"/>
+          <w:sz w:val="18"/>
+          <w:szCs w:val="18"/>
+        </w:rPr>
+        <w:t>compatibility; a broad component adapter cannot widen a role. Each conversion occurrence must have</w:t>
+      </w:r>
+    </w:p>
+    <w:p>
+      <w:pPr/>
+      <w:r>
+        <w:rPr>
+          <w:rFonts w:ascii="Helvetica Light" w:hAnsi="Helvetica Light" w:cs="Helvetica Light"/>
+          <w:sz w:val="18"/>
+          <w:szCs w:val="18"/>
+        </w:rPr>
+        <w:t>its required adjacent protected product-focus context, including repeated conversions. Required</w:t>
+      </w:r>
+    </w:p>
+    <w:p>
+      <w:pPr/>
+      <w:r>
+        <w:rPr>
+          <w:rFonts w:ascii="Helvetica Light" w:hAnsi="Helvetica Light" w:cs="Helvetica Light"/>
+          <w:sz w:val="18"/>
+          <w:szCs w:val="18"/>
+        </w:rPr>
+        <w:t>roles must be satisfiable by non-omittable compatible slots: the initial PDP's always-present product</w:t>
+      </w:r>
+    </w:p>
+    <w:p>
+      <w:pPr/>
+      <w:r>
+        <w:rPr>
+          <w:rFonts w:ascii="Helvetica Light" w:hAnsi="Helvetica Light" w:cs="Helvetica Light"/>
+          <w:sz w:val="18"/>
+          <w:szCs w:val="18"/>
+        </w:rPr>
+        <w:t>information/purchase section owns conversion, while optional product-options may be omitted without</w:t>
+      </w:r>
+    </w:p>
+    <w:p>
+      <w:pPr/>
+      <w:r>
+        <w:rPr>
+          <w:rFonts w:ascii="Helvetica Light" w:hAnsi="Helvetica Light" w:cs="Helvetica Light"/>
+          <w:sz w:val="18"/>
+          <w:szCs w:val="18"/>
+        </w:rPr>
+        <w:t>creating false required semantics.</w:t>
+      </w:r>
+    </w:p>
+    <w:p/>
+    <w:p>
+      <w:pPr/>
+      <w:r>
+        <w:rPr>
+          <w:rFonts w:ascii="Helvetica Light" w:hAnsi="Helvetica Light" w:cs="Helvetica Light"/>
+          <w:sz w:val="18"/>
+          <w:szCs w:val="18"/>
+        </w:rPr>
+        <w:t>Resolved template selections created before Task 6 are persisted as v2 execution identities with no</w:t>
+      </w:r>
+    </w:p>
+    <w:p>
+      <w:pPr/>
+      <w:r>
+        <w:rPr>
+          <w:rFonts w:ascii="Helvetica Light" w:hAnsi="Helvetica Light" w:cs="Helvetica Light"/>
+          <w:sz w:val="18"/>
+          <w:szCs w:val="18"/>
+        </w:rPr>
+        <w:t>narrative metadata. Current selections are v3. A v2 selection is migrated only in memory by verifying</w:t>
+      </w:r>
+    </w:p>
+    <w:p>
+      <w:pPr/>
+      <w:r>
+        <w:rPr>
+          <w:rFonts w:ascii="Helvetica Light" w:hAnsi="Helvetica Light" w:cs="Helvetica Light"/>
+          <w:sz w:val="18"/>
+          <w:szCs w:val="18"/>
+        </w:rPr>
+        <w:t>each legacy homepage, collection and product plan against the registered pre-Task-6 execution</w:t>
+      </w:r>
+    </w:p>
+    <w:p>
+      <w:pPr/>
+      <w:r>
+        <w:rPr>
+          <w:rFonts w:ascii="Helvetica Light" w:hAnsi="Helvetica Light" w:cs="Helvetica Light"/>
+          <w:sz w:val="18"/>
+          <w:szCs w:val="18"/>
+        </w:rPr>
+        <w:t>identity, then re-resolving that exact registered plan with Task-6 metadata. Modified legacy plans</w:t>
+      </w:r>
+    </w:p>
+    <w:p>
+      <w:pPr/>
+      <w:r>
+        <w:rPr>
+          <w:rFonts w:ascii="Helvetica Light" w:hAnsi="Helvetica Light" w:cs="Helvetica Light"/>
+          <w:sz w:val="18"/>
+          <w:szCs w:val="18"/>
+        </w:rPr>
+        <w:t>and unknown future versions fail closed. Migration neither writes project state nor changes canonical</w:t>
+      </w:r>
+    </w:p>
+    <w:p>
+      <w:pPr/>
+      <w:r>
+        <w:rPr>
+          <w:rFonts w:ascii="Helvetica Light" w:hAnsi="Helvetica Light" w:cs="Helvetica Light"/>
+          <w:sz w:val="18"/>
+          <w:szCs w:val="18"/>
+        </w:rPr>
+        <w:t>commerce, bindings, assets, variants or routes; it never mistakes parser defaults for merchant</w:t>
+      </w:r>
+    </w:p>
+    <w:p>
+      <w:pPr/>
+      <w:r>
+        <w:rPr>
+          <w:rFonts w:ascii="Helvetica Light" w:hAnsi="Helvetica Light" w:cs="Helvetica Light"/>
+          <w:sz w:val="18"/>
+          <w:szCs w:val="18"/>
+        </w:rPr>
+        <w:t>selected semantics.</w:t>
       </w:r>
     </w:p>
     <w:p/>

</xml_diff>

<commit_message>
feat: add accepted snapshot publish authority
</commit_message>
<xml_diff>
--- a/docs/VESKIFY_SDD_v1.2.2.docx
+++ b/docs/VESKIFY_SDD_v1.2.2.docx
@@ -2955,6 +2955,173 @@
           <w:sz w:val="18"/>
           <w:szCs w:val="18"/>
         </w:rPr>
+        <w:t>P10A-08B establishes the server-owned accepted-snapshot publication authority seam. After an</w:t>
+      </w:r>
+    </w:p>
+    <w:p>
+      <w:pPr/>
+      <w:r>
+        <w:rPr>
+          <w:rFonts w:ascii="Helvetica Light" w:hAnsi="Helvetica Light" w:cs="Helvetica Light"/>
+          <w:sz w:val="18"/>
+          <w:szCs w:val="18"/>
+        </w:rPr>
+        <w:t>authoritative proposal acceptance transaction, a server-only service may mint one immutable,</w:t>
+      </w:r>
+    </w:p>
+    <w:p>
+      <w:pPr/>
+      <w:r>
+        <w:rPr>
+          <w:rFonts w:ascii="Helvetica Light" w:hAnsi="Helvetica Light" w:cs="Helvetica Light"/>
+          <w:sz w:val="18"/>
+          <w:szCs w:val="18"/>
+        </w:rPr>
+        <w:t>canonically fingerprinted receipt that binds the exact accepted `StorefrontSnapshot` to its project,</w:t>
+      </w:r>
+    </w:p>
+    <w:p>
+      <w:pPr/>
+      <w:r>
+        <w:rPr>
+          <w:rFonts w:ascii="Helvetica Light" w:hAnsi="Helvetica Light" w:cs="Helvetica Light"/>
+          <w:sz w:val="18"/>
+          <w:szCs w:val="18"/>
+        </w:rPr>
+        <w:t>draft, proposal, review, accepted-runtime, registry, manifest, governed package/profile, commerce</w:t>
+      </w:r>
+    </w:p>
+    <w:p>
+      <w:pPr/>
+      <w:r>
+        <w:rPr>
+          <w:rFonts w:ascii="Helvetica Light" w:hAnsi="Helvetica Light" w:cs="Helvetica Light"/>
+          <w:sz w:val="18"/>
+          <w:szCs w:val="18"/>
+        </w:rPr>
+        <w:t>and approved-asset authority where represented. The receipt repository is create-once and rejects</w:t>
+      </w:r>
+    </w:p>
+    <w:p>
+      <w:pPr/>
+      <w:r>
+        <w:rPr>
+          <w:rFonts w:ascii="Helvetica Light" w:hAnsi="Helvetica Light" w:cs="Helvetica Light"/>
+          <w:sz w:val="18"/>
+          <w:szCs w:val="18"/>
+        </w:rPr>
+        <w:t>replay, collision, malformed, modified, missing, stale and cross-authority use. AI-originated</w:t>
+      </w:r>
+    </w:p>
+    <w:p>
+      <w:pPr/>
+      <w:r>
+        <w:rPr>
+          <w:rFonts w:ascii="Helvetica Light" w:hAnsi="Helvetica Light" w:cs="Helvetica Light"/>
+          <w:sz w:val="18"/>
+          <w:szCs w:val="18"/>
+        </w:rPr>
+        <w:t>publication preparation accepts only the receipt identity, resolves trusted storage and validates</w:t>
+      </w:r>
+    </w:p>
+    <w:p>
+      <w:pPr/>
+      <w:r>
+        <w:rPr>
+          <w:rFonts w:ascii="Helvetica Light" w:hAnsi="Helvetica Light" w:cs="Helvetica Light"/>
+          <w:sz w:val="18"/>
+          <w:szCs w:val="18"/>
+        </w:rPr>
+        <w:t>current authority; confirmation resolves and validates it again before a publication write. Manual</w:t>
+      </w:r>
+    </w:p>
+    <w:p>
+      <w:pPr/>
+      <w:r>
+        <w:rPr>
+          <w:rFonts w:ascii="Helvetica Light" w:hAnsi="Helvetica Light" w:cs="Helvetica Light"/>
+          <w:sz w:val="18"/>
+          <w:szCs w:val="18"/>
+        </w:rPr>
+        <w:t>publication remains an explicit separate authority and cannot claim AI acceptance lineage.</w:t>
+      </w:r>
+    </w:p>
+    <w:p/>
+    <w:p>
+      <w:pPr/>
+      <w:r>
+        <w:rPr>
+          <w:rFonts w:ascii="Helvetica Light" w:hAnsi="Helvetica Light" w:cs="Helvetica Light"/>
+          <w:sz w:val="18"/>
+          <w:szCs w:val="18"/>
+        </w:rPr>
+        <w:t>This seam does not complete active-route publishing. Its in-memory repository is deterministic</w:t>
+      </w:r>
+    </w:p>
+    <w:p>
+      <w:pPr/>
+      <w:r>
+        <w:rPr>
+          <w:rFonts w:ascii="Helvetica Light" w:hAnsi="Helvetica Light" w:cs="Helvetica Light"/>
+          <w:sz w:val="18"/>
+          <w:szCs w:val="18"/>
+        </w:rPr>
+        <w:t>contract evidence, not durable production storage. The current merchant browser publish route is</w:t>
+      </w:r>
+    </w:p>
+    <w:p>
+      <w:pPr/>
+      <w:r>
+        <w:rPr>
+          <w:rFonts w:ascii="Helvetica Light" w:hAnsi="Helvetica Light" w:cs="Helvetica Light"/>
+          <w:sz w:val="18"/>
+          <w:szCs w:val="18"/>
+        </w:rPr>
+        <w:t>not migrated by P10A-08B and continues through explicit manual authority. P10A-08C owns authoritative</w:t>
+      </w:r>
+    </w:p>
+    <w:p>
+      <w:pPr/>
+      <w:r>
+        <w:rPr>
+          <w:rFonts w:ascii="Helvetica Light" w:hAnsi="Helvetica Light" w:cs="Helvetica Light"/>
+          <w:sz w:val="18"/>
+          <w:szCs w:val="18"/>
+        </w:rPr>
+        <w:t>acceptance-endpoint wiring, durable receipt persistence, browser/gateway enforcement, compiled</w:t>
+      </w:r>
+    </w:p>
+    <w:p>
+      <w:pPr/>
+      <w:r>
+        <w:rPr>
+          <w:rFonts w:ascii="Helvetica Light" w:hAnsi="Helvetica Light" w:cs="Helvetica Light"/>
+          <w:sz w:val="18"/>
+          <w:szCs w:val="18"/>
+        </w:rPr>
+        <w:t>runtime publication, atomic active-version switching and rollback closure. Until P10A-08C, the</w:t>
+      </w:r>
+    </w:p>
+    <w:p>
+      <w:pPr/>
+      <w:r>
+        <w:rPr>
+          <w:rFonts w:ascii="Helvetica Light" w:hAnsi="Helvetica Light" w:cs="Helvetica Light"/>
+          <w:sz w:val="18"/>
+          <w:szCs w:val="18"/>
+        </w:rPr>
+        <w:t>active merchant route does not enforce end-to-end AI acceptance lineage.</w:t>
+      </w:r>
+    </w:p>
+    <w:p/>
+    <w:p>
+      <w:pPr/>
+      <w:r>
+        <w:rPr>
+          <w:rFonts w:ascii="Helvetica Light" w:hAnsi="Helvetica Light" w:cs="Helvetica Light"/>
+          <w:sz w:val="18"/>
+          <w:szCs w:val="18"/>
+        </w:rPr>
         <w:t>### P10B asset governance and Storefront Studio</w:t>
       </w:r>
     </w:p>
@@ -14778,6 +14945,29 @@
           <w:sz w:val="18"/>
           <w:szCs w:val="18"/>
         </w:rPr>
+        <w:t>- A server-authoritative accepted proposal may mint immutable publication authority for that exact</w:t>
+      </w:r>
+    </w:p>
+    <w:p>
+      <w:pPr/>
+      <w:r>
+        <w:rPr>
+          <w:rFonts w:ascii="Helvetica Light" w:hAnsi="Helvetica Light" w:cs="Helvetica Light"/>
+          <w:sz w:val="18"/>
+          <w:szCs w:val="18"/>
+        </w:rPr>
+        <w:t xml:space="preserve">  accepted snapshot; preview, rejection and browser/provider content cannot mint it.</w:t>
+      </w:r>
+    </w:p>
+    <w:p/>
+    <w:p>
+      <w:pPr/>
+      <w:r>
+        <w:rPr>
+          <w:rFonts w:ascii="Helvetica Light" w:hAnsi="Helvetica Light" w:cs="Helvetica Light"/>
+          <w:sz w:val="18"/>
+          <w:szCs w:val="18"/>
+        </w:rPr>
         <w:t>- Save draft persists work without changing the customer-facing storefront.</w:t>
       </w:r>
     </w:p>
@@ -14803,6 +14993,29 @@
           <w:szCs w:val="18"/>
         </w:rPr>
         <w:t>- History restore creates a new draft and never silently republishes an older version.</w:t>
+      </w:r>
+    </w:p>
+    <w:p/>
+    <w:p>
+      <w:pPr/>
+      <w:r>
+        <w:rPr>
+          <w:rFonts w:ascii="Helvetica Light" w:hAnsi="Helvetica Light" w:cs="Helvetica Light"/>
+          <w:sz w:val="18"/>
+          <w:szCs w:val="18"/>
+        </w:rPr>
+        <w:t>- Undo invalidates a prior AI acceptance receipt until redo restores the exact current runtime,</w:t>
+      </w:r>
+    </w:p>
+    <w:p>
+      <w:pPr/>
+      <w:r>
+        <w:rPr>
+          <w:rFonts w:ascii="Helvetica Light" w:hAnsi="Helvetica Light" w:cs="Helvetica Light"/>
+          <w:sz w:val="18"/>
+          <w:szCs w:val="18"/>
+        </w:rPr>
+        <w:t xml:space="preserve">  proposal/review, snapshot and revision authority; visually matching content alone is insufficient.</w:t>
       </w:r>
     </w:p>
     <w:p/>

</xml_diff>

<commit_message>
docs: synchronize commercial design-system roadmap
</commit_message>
<xml_diff>
--- a/docs/VESKIFY_SDD_v1.2.2.docx
+++ b/docs/VESKIFY_SDD_v1.2.2.docx
@@ -905,6 +905,17 @@
         <w:t>| 1.2.2       | 31 July 2026    | Commercial design vocabulary      | Defines controlled component families, registered PageBlueprint recipe profiles, bounded parametric design, inheritance, reachability and visual-quality gates; it does not close Phase 9 or unblock P10A. |</w:t>
       </w:r>
     </w:p>
+    <w:p>
+      <w:pPr/>
+      <w:r>
+        <w:rPr>
+          <w:rFonts w:ascii="Helvetica Light" w:hAnsi="Helvetica Light" w:cs="Helvetica Light"/>
+          <w:sz w:val="18"/>
+          <w:szCs w:val="18"/>
+        </w:rPr>
+        <w:t>| 1.2.2       | 5 August 2026   | Authoritative commercial roadmap synchronization | Assigns P10B Commercial Storefront Design System v1 after P10A publishing closure; migrates former P10B Studio/asset work to P10C, defers advanced media to P10D, and sequences integration and production hardening afterward. |</w:t>
+      </w:r>
+    </w:p>
     <w:p/>
     <w:p>
       <w:pPr/>
@@ -1714,18 +1725,18 @@
           <w:sz w:val="18"/>
           <w:szCs w:val="18"/>
         </w:rPr>
-        <w:t>or unrestricted vocabulary scaling. Broad controlled-vocabulary expansion occurs after the Phase</w:t>
-      </w:r>
-    </w:p>
-    <w:p>
-      <w:pPr/>
-      <w:r>
-        <w:rPr>
-          <w:rFonts w:ascii="Helvetica Light" w:hAnsi="Helvetica Light" w:cs="Helvetica Light"/>
-          <w:sz w:val="18"/>
-          <w:szCs w:val="18"/>
-        </w:rPr>
-        <w:t>9 proof gates, through P10A-04’s generated registry and canonical validation.</w:t>
+        <w:t>or unrestricted vocabulary scaling. Broad commercial vocabulary expansion occurs after the Phase</w:t>
+      </w:r>
+    </w:p>
+    <w:p>
+      <w:pPr/>
+      <w:r>
+        <w:rPr>
+          <w:rFonts w:ascii="Helvetica Light" w:hAnsi="Helvetica Light" w:cs="Helvetica Light"/>
+          <w:sz w:val="18"/>
+          <w:szCs w:val="18"/>
+        </w:rPr>
+        <w:t>9 proof gates and P10A publishing closure, through P10B’s use of the generated registry and canonical validation.</w:t>
       </w:r>
     </w:p>
     <w:p/>
@@ -2040,29 +2051,29 @@
           <w:sz w:val="18"/>
           <w:szCs w:val="18"/>
         </w:rPr>
-        <w:t>| AC-121 | P10B Storefront Studio merchant UX. Phase 9 still owns fixture/provider/internal-term leakage in generated storefront output. |</w:t>
-      </w:r>
-    </w:p>
-    <w:p>
-      <w:pPr/>
-      <w:r>
-        <w:rPr>
-          <w:rFonts w:ascii="Helvetica Light" w:hAnsi="Helvetica Light" w:cs="Helvetica Light"/>
-          <w:sz w:val="18"/>
-          <w:szCs w:val="18"/>
-        </w:rPr>
-        <w:t>| AC-122 | Split: Phase 9 owns generated storefront output at all target widths; P10B owns Storefront Studio shell and workflow responsiveness. |</w:t>
-      </w:r>
-    </w:p>
-    <w:p>
-      <w:pPr/>
-      <w:r>
-        <w:rPr>
-          <w:rFonts w:ascii="Helvetica Light" w:hAnsi="Helvetica Light" w:cs="Helvetica Light"/>
-          <w:sz w:val="18"/>
-          <w:szCs w:val="18"/>
-        </w:rPr>
-        <w:t>| AC-123 | Split: Phase 9 owns generated storefront semantics and interactive commerce controls; P10B owns Studio controls, proposal review, save and publish accessibility. |</w:t>
+        <w:t>| AC-121 | P10C Storefront Studio merchant UX. Phase 9 still owns fixture/provider/internal-term leakage in generated storefront output. |</w:t>
+      </w:r>
+    </w:p>
+    <w:p>
+      <w:pPr/>
+      <w:r>
+        <w:rPr>
+          <w:rFonts w:ascii="Helvetica Light" w:hAnsi="Helvetica Light" w:cs="Helvetica Light"/>
+          <w:sz w:val="18"/>
+          <w:szCs w:val="18"/>
+        </w:rPr>
+        <w:t>| AC-122 | Split: Phase 9 owns generated storefront output at all target widths; P10C owns Storefront Studio shell and workflow responsiveness. |</w:t>
+      </w:r>
+    </w:p>
+    <w:p>
+      <w:pPr/>
+      <w:r>
+        <w:rPr>
+          <w:rFonts w:ascii="Helvetica Light" w:hAnsi="Helvetica Light" w:cs="Helvetica Light"/>
+          <w:sz w:val="18"/>
+          <w:szCs w:val="18"/>
+        </w:rPr>
+        <w:t>| AC-123 | Split: Phase 9 owns generated storefront semantics and interactive commerce controls; P10C owns Studio controls, proposal review, save and publish accessibility. |</w:t>
       </w:r>
     </w:p>
     <w:p/>
@@ -2220,29 +2231,18 @@
           <w:sz w:val="18"/>
           <w:szCs w:val="18"/>
         </w:rPr>
-        <w:t xml:space="preserve">   canonical contracts, including the executable PageBlueprint contracts produced by P10A-03,</w:t>
-      </w:r>
-    </w:p>
-    <w:p>
-      <w:pPr/>
-      <w:r>
-        <w:rPr>
-          <w:rFonts w:ascii="Helvetica Light" w:hAnsi="Helvetica Light" w:cs="Helvetica Light"/>
-          <w:sz w:val="18"/>
-          <w:szCs w:val="18"/>
-        </w:rPr>
-        <w:t xml:space="preserve">   and broaden the controlled vocabulary only through validated canonical registrations exposed</w:t>
-      </w:r>
-    </w:p>
-    <w:p>
-      <w:pPr/>
-      <w:r>
-        <w:rPr>
-          <w:rFonts w:ascii="Helvetica Light" w:hAnsi="Helvetica Light" w:cs="Helvetica Light"/>
-          <w:sz w:val="18"/>
-          <w:szCs w:val="18"/>
-        </w:rPr>
-        <w:t xml:space="preserve">   by that generated view after the Phase 9 proof gate.</w:t>
+        <w:t xml:space="preserve">   canonical contracts, including the executable PageBlueprint contracts produced by P10A-03.</w:t>
+      </w:r>
+    </w:p>
+    <w:p>
+      <w:pPr/>
+      <w:r>
+        <w:rPr>
+          <w:rFonts w:ascii="Helvetica Light" w:hAnsi="Helvetica Light" w:cs="Helvetica Light"/>
+          <w:sz w:val="18"/>
+          <w:szCs w:val="18"/>
+        </w:rPr>
+        <w:t xml:space="preserve">   P10B consumes this registered view for commercial vocabulary and visual-quality expansion.</w:t>
       </w:r>
     </w:p>
     <w:p>
@@ -2308,18 +2308,18 @@
           <w:sz w:val="18"/>
           <w:szCs w:val="18"/>
         </w:rPr>
-        <w:t>7. **P10A-07 — Golden-store quality gates:** deterministic and real-provider evaluation across</w:t>
-      </w:r>
-    </w:p>
-    <w:p>
-      <w:pPr/>
-      <w:r>
-        <w:rPr>
-          <w:rFonts w:ascii="Helvetica Light" w:hAnsi="Helvetica Light" w:cs="Helvetica Light"/>
-          <w:sz w:val="18"/>
-          <w:szCs w:val="18"/>
-        </w:rPr>
-        <w:t xml:space="preserve">   representative catalogues, including at least one non-jewellery merchant.</w:t>
+        <w:t>7. **P10A-07 — Evidence-harness groundwork:** deterministic and real-provider evaluation</w:t>
+      </w:r>
+    </w:p>
+    <w:p>
+      <w:pPr/>
+      <w:r>
+        <w:rPr>
+          <w:rFonts w:ascii="Helvetica Light" w:hAnsi="Helvetica Light" w:cs="Helvetica Light"/>
+          <w:sz w:val="18"/>
+          <w:szCs w:val="18"/>
+        </w:rPr>
+        <w:t xml:space="preserve">   infrastructure across representative catalogues, including at least one non-jewellery merchant.</w:t>
       </w:r>
     </w:p>
     <w:p>
@@ -2764,7 +2764,7 @@
           <w:sz w:val="18"/>
           <w:szCs w:val="18"/>
         </w:rPr>
-        <w:t>approval controls and proposal execution belong to Phase 11.</w:t>
+        <w:t>approval controls and proposal execution belong to P10C.</w:t>
       </w:r>
     </w:p>
     <w:p/>
@@ -2787,7 +2787,7 @@
           <w:sz w:val="18"/>
           <w:szCs w:val="18"/>
         </w:rPr>
-        <w:t>merchant-operable granular editing. Phase 11 implements and exposes those scopes as working merchant</w:t>
+        <w:t>merchant-operable granular editing. P10C implements and exposes those scopes as working merchant</w:t>
       </w:r>
     </w:p>
     <w:p>
@@ -2810,73 +2810,73 @@
           <w:sz w:val="18"/>
           <w:szCs w:val="18"/>
         </w:rPr>
-        <w:t>P10A-07 golden stores include premium/minimal jewellery, editorial jewellery, a watch retailer, a</w:t>
-      </w:r>
-    </w:p>
-    <w:p>
-      <w:pPr/>
-      <w:r>
-        <w:rPr>
-          <w:rFonts w:ascii="Helvetica Light" w:hAnsi="Helvetica Light" w:cs="Helvetica Light"/>
-          <w:sz w:val="18"/>
-          <w:szCs w:val="18"/>
-        </w:rPr>
-        <w:t>dense hardware/general-retail catalogue, EN/FI, a simple watch PDP and a complex configurable ring</w:t>
-      </w:r>
-    </w:p>
-    <w:p>
-      <w:pPr/>
-      <w:r>
-        <w:rPr>
-          <w:rFonts w:ascii="Helvetica Light" w:hAnsi="Helvetica Light" w:cs="Helvetica Light"/>
-          <w:sz w:val="18"/>
-          <w:szCs w:val="18"/>
-        </w:rPr>
-        <w:t>PDP. The non-jewellery fixture is mandatory to detect luxury, jewellery, Karvonen and sparse-catalog</w:t>
-      </w:r>
-    </w:p>
-    <w:p>
-      <w:pPr/>
-      <w:r>
-        <w:rPr>
-          <w:rFonts w:ascii="Helvetica Light" w:hAnsi="Helvetica Light" w:cs="Helvetica Light"/>
-          <w:sz w:val="18"/>
-          <w:szCs w:val="18"/>
-        </w:rPr>
-        <w:t>assumptions. Gates cover schemas, registered capabilities, bindings/commerce, responsive behavior,</w:t>
-      </w:r>
-    </w:p>
-    <w:p>
-      <w:pPr/>
-      <w:r>
-        <w:rPr>
-          <w:rFonts w:ascii="Helvetica Light" w:hAnsi="Helvetica Light" w:cs="Helvetica Light"/>
-          <w:sz w:val="18"/>
-          <w:szCs w:val="18"/>
-        </w:rPr>
-        <w:t>accessibility, brand/page coherence, diversity, fixture leakage, asset provenance, performance and</w:t>
-      </w:r>
-    </w:p>
-    <w:p>
-      <w:pPr/>
-      <w:r>
-        <w:rPr>
-          <w:rFonts w:ascii="Helvetica Light" w:hAnsi="Helvetica Light" w:cs="Helvetica Light"/>
-          <w:sz w:val="18"/>
-          <w:szCs w:val="18"/>
-        </w:rPr>
-        <w:t>the contract validations owned by P10A. Runtime mixed-scope history and Undo/Redo for granular</w:t>
-      </w:r>
-    </w:p>
-    <w:p>
-      <w:pPr/>
-      <w:r>
-        <w:rPr>
-          <w:rFonts w:ascii="Helvetica Light" w:hAnsi="Helvetica Light" w:cs="Helvetica Light"/>
-          <w:sz w:val="18"/>
-          <w:szCs w:val="18"/>
-        </w:rPr>
-        <w:t>editing are Phase 11 gates.</w:t>
+        <w:t>P10A-07 evidence-harness groundwork includes premium/minimal jewellery, editorial jewellery, a</w:t>
+      </w:r>
+    </w:p>
+    <w:p>
+      <w:pPr/>
+      <w:r>
+        <w:rPr>
+          <w:rFonts w:ascii="Helvetica Light" w:hAnsi="Helvetica Light" w:cs="Helvetica Light"/>
+          <w:sz w:val="18"/>
+          <w:szCs w:val="18"/>
+        </w:rPr>
+        <w:t>watch retailer, a dense hardware/general-retail catalogue, EN/FI, a simple watch PDP and a complex</w:t>
+      </w:r>
+    </w:p>
+    <w:p>
+      <w:pPr/>
+      <w:r>
+        <w:rPr>
+          <w:rFonts w:ascii="Helvetica Light" w:hAnsi="Helvetica Light" w:cs="Helvetica Light"/>
+          <w:sz w:val="18"/>
+          <w:szCs w:val="18"/>
+        </w:rPr>
+        <w:t>configurable ring PDP. The non-jewellery fixture is mandatory to detect luxury, jewellery, Karvonen</w:t>
+      </w:r>
+    </w:p>
+    <w:p>
+      <w:pPr/>
+      <w:r>
+        <w:rPr>
+          <w:rFonts w:ascii="Helvetica Light" w:hAnsi="Helvetica Light" w:cs="Helvetica Light"/>
+          <w:sz w:val="18"/>
+          <w:szCs w:val="18"/>
+        </w:rPr>
+        <w:t>and sparse-catalog assumptions. It covers schemas, registered capabilities, bindings/commerce,</w:t>
+      </w:r>
+    </w:p>
+    <w:p>
+      <w:pPr/>
+      <w:r>
+        <w:rPr>
+          <w:rFonts w:ascii="Helvetica Light" w:hAnsi="Helvetica Light" w:cs="Helvetica Light"/>
+          <w:sz w:val="18"/>
+          <w:szCs w:val="18"/>
+        </w:rPr>
+        <w:t>responsive behavior, accessibility, fixture leakage, asset provenance, performance and the contract</w:t>
+      </w:r>
+    </w:p>
+    <w:p>
+      <w:pPr/>
+      <w:r>
+        <w:rPr>
+          <w:rFonts w:ascii="Helvetica Light" w:hAnsi="Helvetica Light" w:cs="Helvetica Light"/>
+          <w:sz w:val="18"/>
+          <w:szCs w:val="18"/>
+        </w:rPr>
+        <w:t>validations owned by P10A. P10B owns the final commercial diversity, cross-page and browser-quality</w:t>
+      </w:r>
+    </w:p>
+    <w:p>
+      <w:pPr/>
+      <w:r>
+        <w:rPr>
+          <w:rFonts w:ascii="Helvetica Light" w:hAnsi="Helvetica Light" w:cs="Helvetica Light"/>
+          <w:sz w:val="18"/>
+          <w:szCs w:val="18"/>
+        </w:rPr>
+        <w:t>gate; runtime mixed-scope history and Undo/Redo for granular editing are P10C gates.</w:t>
       </w:r>
     </w:p>
     <w:p/>
@@ -2955,444 +2955,151 @@
           <w:sz w:val="18"/>
           <w:szCs w:val="18"/>
         </w:rPr>
-        <w:t>### P10B asset governance and Storefront Studio</w:t>
-      </w:r>
-    </w:p>
-    <w:p/>
-    <w:p>
-      <w:pPr/>
-      <w:r>
-        <w:rPr>
-          <w:rFonts w:ascii="Helvetica Light" w:hAnsi="Helvetica Light" w:cs="Helvetica Light"/>
-          <w:sz w:val="18"/>
-          <w:szCs w:val="18"/>
-        </w:rPr>
-        <w:t>P10B follows P10A and consumes its capability/scope contracts:</w:t>
-      </w:r>
-    </w:p>
-    <w:p/>
-    <w:p>
-      <w:pPr/>
-      <w:r>
-        <w:rPr>
-          <w:rFonts w:ascii="Helvetica Light" w:hAnsi="Helvetica Light" w:cs="Helvetica Light"/>
-          <w:sz w:val="18"/>
-          <w:szCs w:val="18"/>
-        </w:rPr>
-        <w:t>- **P10B-01 — Brand asset upload/library:** primary/alternate/light/dark logos, favicons, brand,</w:t>
-      </w:r>
-    </w:p>
-    <w:p>
-      <w:pPr/>
-      <w:r>
-        <w:rPr>
-          <w:rFonts w:ascii="Helvetica Light" w:hAnsi="Helvetica Light" w:cs="Helvetica Light"/>
-          <w:sz w:val="18"/>
-          <w:szCs w:val="18"/>
-        </w:rPr>
-        <w:t xml:space="preserve">  campaign, editorial and story imagery, marks/icons, approved illustrations, textures, permitted</w:t>
-      </w:r>
-    </w:p>
-    <w:p>
-      <w:pPr/>
-      <w:r>
-        <w:rPr>
-          <w:rFonts w:ascii="Helvetica Light" w:hAnsi="Helvetica Light" w:cs="Helvetica Light"/>
-          <w:sz w:val="18"/>
-          <w:szCs w:val="18"/>
-        </w:rPr>
-        <w:t xml:space="preserve">  fonts and supported video. Fixture/developer registration is not the merchant workflow.</w:t>
-      </w:r>
-    </w:p>
-    <w:p>
-      <w:pPr/>
-      <w:r>
-        <w:rPr>
-          <w:rFonts w:ascii="Helvetica Light" w:hAnsi="Helvetica Light" w:cs="Helvetica Light"/>
-          <w:sz w:val="18"/>
-          <w:szCs w:val="18"/>
-        </w:rPr>
-        <w:t>- **P10B-02 — Roles/provenance/metadata:** stable ID/domain, provenance, approval, role, dimensions,</w:t>
-      </w:r>
-    </w:p>
-    <w:p>
-      <w:pPr/>
-      <w:r>
-        <w:rPr>
-          <w:rFonts w:ascii="Helvetica Light" w:hAnsi="Helvetica Light" w:cs="Helvetica Light"/>
-          <w:sz w:val="18"/>
-          <w:szCs w:val="18"/>
-        </w:rPr>
-        <w:t xml:space="preserve">  focal point, crop constraints, alt text, locale/market, light/dark suitability, usage restrictions</w:t>
-      </w:r>
-    </w:p>
-    <w:p>
-      <w:pPr/>
-      <w:r>
-        <w:rPr>
-          <w:rFonts w:ascii="Helvetica Light" w:hAnsi="Helvetica Light" w:cs="Helvetica Light"/>
-          <w:sz w:val="18"/>
-          <w:szCs w:val="18"/>
-        </w:rPr>
-        <w:t xml:space="preserve">  and uploaded/generated origin. Canonical product/variant media, merchant brand, campaign,</w:t>
-      </w:r>
-    </w:p>
-    <w:p>
-      <w:pPr/>
-      <w:r>
-        <w:rPr>
-          <w:rFonts w:ascii="Helvetica Light" w:hAnsi="Helvetica Light" w:cs="Helvetica Light"/>
-          <w:sz w:val="18"/>
-          <w:szCs w:val="18"/>
-        </w:rPr>
-        <w:t xml:space="preserve">  editorial, temporary generated and accepted generated assets remain distinct.</w:t>
-      </w:r>
-    </w:p>
-    <w:p>
-      <w:pPr/>
-      <w:r>
-        <w:rPr>
-          <w:rFonts w:ascii="Helvetica Light" w:hAnsi="Helvetica Light" w:cs="Helvetica Light"/>
-          <w:sz w:val="18"/>
-          <w:szCs w:val="18"/>
-        </w:rPr>
-        <w:t>- **P10B-03 — Generated-image lifecycle:** merchant request → capability/policy check → temporary</w:t>
-      </w:r>
-    </w:p>
-    <w:p>
-      <w:pPr/>
-      <w:r>
-        <w:rPr>
-          <w:rFonts w:ascii="Helvetica Light" w:hAnsi="Helvetica Light" w:cs="Helvetica Light"/>
-          <w:sz w:val="18"/>
-          <w:szCs w:val="18"/>
-        </w:rPr>
-        <w:t xml:space="preserve">  proposal asset → technical/safety validation → merchant review → accept/reject → promotion to the</w:t>
-      </w:r>
-    </w:p>
-    <w:p>
-      <w:pPr/>
-      <w:r>
-        <w:rPr>
-          <w:rFonts w:ascii="Helvetica Light" w:hAnsi="Helvetica Light" w:cs="Helvetica Light"/>
-          <w:sz w:val="18"/>
-          <w:szCs w:val="18"/>
-        </w:rPr>
-        <w:t xml:space="preserve">  approved library → snapshot binding to a stable ID. Generated imagery may support hero,</w:t>
-      </w:r>
-    </w:p>
-    <w:p>
-      <w:pPr/>
-      <w:r>
-        <w:rPr>
-          <w:rFonts w:ascii="Helvetica Light" w:hAnsi="Helvetica Light" w:cs="Helvetica Light"/>
-          <w:sz w:val="18"/>
-          <w:szCs w:val="18"/>
-        </w:rPr>
-        <w:t xml:space="preserve">  campaign, lifestyle/editorial, decorative background or abstract brand use but never silently</w:t>
-      </w:r>
-    </w:p>
-    <w:p>
-      <w:pPr/>
-      <w:r>
-        <w:rPr>
-          <w:rFonts w:ascii="Helvetica Light" w:hAnsi="Helvetica Light" w:cs="Helvetica Light"/>
-          <w:sz w:val="18"/>
-          <w:szCs w:val="18"/>
-        </w:rPr>
-        <w:t xml:space="preserve">  replace canonical product/variant media.</w:t>
-      </w:r>
-    </w:p>
-    <w:p>
-      <w:pPr/>
-      <w:r>
-        <w:rPr>
-          <w:rFonts w:ascii="Helvetica Light" w:hAnsi="Helvetica Light" w:cs="Helvetica Light"/>
-          <w:sz w:val="18"/>
-          <w:szCs w:val="18"/>
-        </w:rPr>
-        <w:t>- **P10B-04 — Studio shell:** native Vesko shell, dominant canvas, compact page/section outline,</w:t>
-      </w:r>
-    </w:p>
-    <w:p>
-      <w:pPr/>
-      <w:r>
-        <w:rPr>
-          <w:rFonts w:ascii="Helvetica Light" w:hAnsi="Helvetica Light" w:cs="Helvetica Light"/>
-          <w:sz w:val="18"/>
-          <w:szCs w:val="18"/>
-        </w:rPr>
-        <w:t xml:space="preserve">  Design and AI tabs, merchant language, proposal review, preview, draft, publish, history,</w:t>
-      </w:r>
-    </w:p>
-    <w:p>
-      <w:pPr/>
-      <w:r>
-        <w:rPr>
-          <w:rFonts w:ascii="Helvetica Light" w:hAnsi="Helvetica Light" w:cs="Helvetica Light"/>
-          <w:sz w:val="18"/>
-          <w:szCs w:val="18"/>
-        </w:rPr>
-        <w:t xml:space="preserve">  responsive drawers/bottom sheets and keyboard/accessibility. A polished shell must not conceal an</w:t>
-      </w:r>
-    </w:p>
-    <w:p>
-      <w:pPr/>
-      <w:r>
-        <w:rPr>
-          <w:rFonts w:ascii="Helvetica Light" w:hAnsi="Helvetica Light" w:cs="Helvetica Light"/>
-          <w:sz w:val="18"/>
-          <w:szCs w:val="18"/>
-        </w:rPr>
-        <w:t xml:space="preserve">  ungrounded generator.</w:t>
-      </w:r>
-    </w:p>
-    <w:p/>
-    <w:p>
-      <w:pPr/>
-      <w:r>
-        <w:rPr>
-          <w:rFonts w:ascii="Helvetica Light" w:hAnsi="Helvetica Light" w:cs="Helvetica Light"/>
-          <w:sz w:val="18"/>
-          <w:szCs w:val="18"/>
-        </w:rPr>
-        <w:t>Existing `AssetInventory` roles/provenance are the foundation; do not create a competing media</w:t>
-      </w:r>
-    </w:p>
-    <w:p>
-      <w:pPr/>
-      <w:r>
-        <w:rPr>
-          <w:rFonts w:ascii="Helvetica Light" w:hAnsi="Helvetica Light" w:cs="Helvetica Light"/>
-          <w:sz w:val="18"/>
-          <w:szCs w:val="18"/>
-        </w:rPr>
-        <w:t>system.</w:t>
-      </w:r>
-    </w:p>
-    <w:p/>
-    <w:p>
-      <w:pPr/>
-      <w:r>
-        <w:rPr>
-          <w:rFonts w:ascii="Helvetica Light" w:hAnsi="Helvetica Light" w:cs="Helvetica Light"/>
-          <w:sz w:val="18"/>
-          <w:szCs w:val="18"/>
-        </w:rPr>
-        <w:t>### Phase 11 granular editing</w:t>
-      </w:r>
-    </w:p>
-    <w:p/>
-    <w:p>
-      <w:pPr/>
-      <w:r>
-        <w:rPr>
-          <w:rFonts w:ascii="Helvetica Light" w:hAnsi="Helvetica Light" w:cs="Helvetica Light"/>
-          <w:sz w:val="18"/>
-          <w:szCs w:val="18"/>
-        </w:rPr>
-        <w:t>Phase 11 implements and exposes the scopes defined and validated by P10A as working merchant</w:t>
-      </w:r>
-    </w:p>
-    <w:p>
-      <w:pPr/>
-      <w:r>
-        <w:rPr>
-          <w:rFonts w:ascii="Helvetica Light" w:hAnsi="Helvetica Light" w:cs="Helvetica Light"/>
-          <w:sz w:val="18"/>
-          <w:szCs w:val="18"/>
-        </w:rPr>
-        <w:t>features. It owns selecting a component or section; applying a selected-section proposal;</w:t>
-      </w:r>
-    </w:p>
-    <w:p>
-      <w:pPr/>
-      <w:r>
-        <w:rPr>
-          <w:rFonts w:ascii="Helvetica Light" w:hAnsi="Helvetica Light" w:cs="Helvetica Light"/>
-          <w:sz w:val="18"/>
-          <w:szCs w:val="18"/>
-        </w:rPr>
-        <w:t>current-page editing; shared storefront frame editing; design-system editing; complete-storefront</w:t>
-      </w:r>
-    </w:p>
-    <w:p>
-      <w:pPr/>
-      <w:r>
-        <w:rPr>
-          <w:rFonts w:ascii="Helvetica Light" w:hAnsi="Helvetica Light" w:cs="Helvetica Light"/>
-          <w:sz w:val="18"/>
-          <w:szCs w:val="18"/>
-        </w:rPr>
-        <w:t>editing; add, remove, reorder and replace operations; proposal preview and acceptance; mixed-scope</w:t>
-      </w:r>
-    </w:p>
-    <w:p>
-      <w:pPr/>
-      <w:r>
-        <w:rPr>
-          <w:rFonts w:ascii="Helvetica Light" w:hAnsi="Helvetica Light" w:cs="Helvetica Light"/>
-          <w:sz w:val="18"/>
-          <w:szCs w:val="18"/>
-        </w:rPr>
-        <w:t>history; Undo/Redo; and merchant scope controls and warnings. It provides stable section identity,</w:t>
-      </w:r>
-    </w:p>
-    <w:p>
-      <w:pPr/>
-      <w:r>
-        <w:rPr>
-          <w:rFonts w:ascii="Helvetica Light" w:hAnsi="Helvetica Light" w:cs="Helvetica Light"/>
-          <w:sz w:val="18"/>
-          <w:szCs w:val="18"/>
-        </w:rPr>
-        <w:t>local coherence and runtime enforcement of the P10A prohibition against silent scope widening.</w:t>
-      </w:r>
-    </w:p>
-    <w:p>
-      <w:pPr/>
-      <w:r>
-        <w:rPr>
-          <w:rFonts w:ascii="Helvetica Light" w:hAnsi="Helvetica Light" w:cs="Helvetica Light"/>
-          <w:sz w:val="18"/>
-          <w:szCs w:val="18"/>
-        </w:rPr>
-        <w:t>Common targets include header/navigation/announcement, hero, featured collections/products, brand</w:t>
-      </w:r>
-    </w:p>
-    <w:p>
-      <w:pPr/>
-      <w:r>
-        <w:rPr>
-          <w:rFonts w:ascii="Helvetica Light" w:hAnsi="Helvetica Light" w:cs="Helvetica Light"/>
-          <w:sz w:val="18"/>
-          <w:szCs w:val="18"/>
-        </w:rPr>
-        <w:t>story, campaign/trust, collection discovery/grid, PDP gallery/information/options/specifications and</w:t>
-      </w:r>
-    </w:p>
-    <w:p>
-      <w:pPr/>
-      <w:r>
-        <w:rPr>
-          <w:rFonts w:ascii="Helvetica Light" w:hAnsi="Helvetica Light" w:cs="Helvetica Light"/>
-          <w:sz w:val="18"/>
-          <w:szCs w:val="18"/>
-        </w:rPr>
-        <w:t>footer.</w:t>
-      </w:r>
-    </w:p>
-    <w:p/>
-    <w:p>
-      <w:pPr/>
-      <w:r>
-        <w:rPr>
-          <w:rFonts w:ascii="Helvetica Light" w:hAnsi="Helvetica Light" w:cs="Helvetica Light"/>
-          <w:sz w:val="18"/>
-          <w:szCs w:val="18"/>
-        </w:rPr>
-        <w:t>### Phase 12 canonical domains and adapters</w:t>
-      </w:r>
-    </w:p>
-    <w:p/>
-    <w:p>
-      <w:pPr/>
-      <w:r>
-        <w:rPr>
-          <w:rFonts w:ascii="Helvetica Light" w:hAnsi="Helvetica Light" w:cs="Helvetica Light"/>
-          <w:sz w:val="18"/>
-          <w:szCs w:val="18"/>
-        </w:rPr>
-        <w:t>Phase 12 consolidates canonical product, variant/option, collection/navigation,</w:t>
-      </w:r>
-    </w:p>
-    <w:p>
-      <w:pPr/>
-      <w:r>
-        <w:rPr>
-          <w:rFonts w:ascii="Helvetica Light" w:hAnsi="Helvetica Light" w:cs="Helvetica Light"/>
-          <w:sz w:val="18"/>
-          <w:szCs w:val="18"/>
-        </w:rPr>
-        <w:t>price/availability-presentation, localization, product-media, brand-asset and generated-asset</w:t>
-      </w:r>
-    </w:p>
-    <w:p>
-      <w:pPr/>
-      <w:r>
-        <w:rPr>
-          <w:rFonts w:ascii="Helvetica Light" w:hAnsi="Helvetica Light" w:cs="Helvetica Light"/>
-          <w:sz w:val="18"/>
-          <w:szCs w:val="18"/>
-        </w:rPr>
-        <w:t>domains. Versioned image-delivery, commerce, collection/navigation and asset adapters define</w:t>
-      </w:r>
-    </w:p>
-    <w:p>
-      <w:pPr/>
-      <w:r>
-        <w:rPr>
-          <w:rFonts w:ascii="Helvetica Light" w:hAnsi="Helvetica Light" w:cs="Helvetica Light"/>
-          <w:sz w:val="18"/>
-          <w:szCs w:val="18"/>
-        </w:rPr>
-        <w:t>capability negotiation, synchronization semantics, typed errors, versioning, conformance fixtures</w:t>
-      </w:r>
-    </w:p>
-    <w:p>
-      <w:pPr/>
-      <w:r>
-        <w:rPr>
-          <w:rFonts w:ascii="Helvetica Light" w:hAnsi="Helvetica Light" w:cs="Helvetica Light"/>
-          <w:sz w:val="18"/>
-          <w:szCs w:val="18"/>
-        </w:rPr>
-        <w:t>and integration documentation. Vesko is the first reference implementation of these canonical</w:t>
-      </w:r>
-    </w:p>
-    <w:p>
-      <w:pPr/>
-      <w:r>
-        <w:rPr>
-          <w:rFonts w:ascii="Helvetica Light" w:hAnsi="Helvetica Light" w:cs="Helvetica Light"/>
-          <w:sz w:val="18"/>
-          <w:szCs w:val="18"/>
-        </w:rPr>
-        <w:t>contracts, not a special case embedded through the editor.</w:t>
-      </w:r>
-    </w:p>
-    <w:p/>
-    <w:p>
-      <w:pPr/>
-      <w:r>
-        <w:rPr>
-          <w:rFonts w:ascii="Helvetica Light" w:hAnsi="Helvetica Light" w:cs="Helvetica Light"/>
-          <w:sz w:val="18"/>
-          <w:szCs w:val="18"/>
-        </w:rPr>
-        <w:t>Immediate full staging integration is not a Phase 12 prerequisite. Authentication, authorization,</w:t>
-      </w:r>
-    </w:p>
-    <w:p>
-      <w:pPr/>
-      <w:r>
-        <w:rPr>
-          <w:rFonts w:ascii="Helvetica Light" w:hAnsi="Helvetica Light" w:cs="Helvetica Light"/>
-          <w:sz w:val="18"/>
-          <w:szCs w:val="18"/>
-        </w:rPr>
-        <w:t>tenant isolation, production persistence, hosted staging, observability, recovery, pilot operations</w:t>
-      </w:r>
-    </w:p>
-    <w:p>
-      <w:pPr/>
-      <w:r>
-        <w:rPr>
-          <w:rFonts w:ascii="Helvetica Light" w:hAnsi="Helvetica Light" w:cs="Helvetica Light"/>
-          <w:sz w:val="18"/>
-          <w:szCs w:val="18"/>
-        </w:rPr>
-        <w:t>and release remain later deployment work.</w:t>
+        <w:t>### P10B Commercial Storefront Design System v1</w:t>
+      </w:r>
+    </w:p>
+    <w:p/>
+    <w:p>
+      <w:pPr/>
+      <w:r>
+        <w:rPr>
+          <w:rFonts w:ascii="Helvetica Light" w:hAnsi="Helvetica Light" w:cs="Helvetica Light"/>
+          <w:sz w:val="18"/>
+          <w:szCs w:val="18"/>
+        </w:rPr>
+        <w:t>P10B follows P10A publishing closure and is the first phase that broadens commercial visual quality. It owns P10B-01 executable vocabulary, P10B-02 foundations, P10B-03 image/art direction, P10B-04 premium shared frame, P10B-05 hero/editorial/campaign families, P10B-06 product-card and merchandising system, P10B-07 collection profiles, P10B-08 PDP profiles, P10B-09 coordinated directions, P10B-10 narrative composition, P10B-11 responsive closure and P10B-12 visual-quality gate. These tasks extend only the existing canonical `BrandSystem`, registered `PageBlueprint` profiles, component families/variants, approved asset placement and `StorefrontSnapshot` lifecycle.</w:t>
+      </w:r>
+    </w:p>
+    <w:p/>
+    <w:p>
+      <w:pPr/>
+      <w:r>
+        <w:rPr>
+          <w:rFonts w:ascii="Helvetica Light" w:hAnsi="Helvetica Light" w:cs="Helvetica Light"/>
+          <w:sz w:val="18"/>
+          <w:szCs w:val="18"/>
+        </w:rPr>
+        <w:t>P10B closes only when credible assets prove a complete homepage, collection, simple PDP and configurable PDP at 375, 768, 1024 and 1440 px. Review must prove strong typography and imagery, coherent storytelling, cross-page identity, meaningful directions, commercially credible mobile output and protected-commerce correctness; unit, schema, placeholder, generic-starter-theme, repetitive-stack or unexplained-gap evidence is insufficient.</w:t>
+      </w:r>
+    </w:p>
+    <w:p/>
+    <w:p>
+      <w:pPr/>
+      <w:r>
+        <w:rPr>
+          <w:rFonts w:ascii="Helvetica Light" w:hAnsi="Helvetica Light" w:cs="Helvetica Light"/>
+          <w:sz w:val="18"/>
+          <w:szCs w:val="18"/>
+        </w:rPr>
+        <w:t>### P10C Storefront Studio Editing Experience v1</w:t>
+      </w:r>
+    </w:p>
+    <w:p/>
+    <w:p>
+      <w:pPr/>
+      <w:r>
+        <w:rPr>
+          <w:rFonts w:ascii="Helvetica Light" w:hAnsi="Helvetica Light" w:cs="Helvetica Light"/>
+          <w:sz w:val="18"/>
+          <w:szCs w:val="18"/>
+        </w:rPr>
+        <w:t>P10C follows P10B. It migrates former P10B-01 to **P10C-01 Brand asset library**, former P10B-02 to **P10C-02 Asset roles and provenance**, and former P10B-04 to **P10C-08 Brand and asset editor with Studio shell**. It adds P10C-03 canonical Puck boundary, P10C-04 stable frame identity, P10C-05 approved manual frame operations, P10C-06 scoped AI frame/page/shared-frame editing, P10C-07 unified AI/manual history and P10C-09 Studio commercial QA. Existing `AssetInventory` roles/provenance remain the foundation; no competing media, Puck document or history model is introduced.</w:t>
+      </w:r>
+    </w:p>
+    <w:p/>
+    <w:p>
+      <w:pPr/>
+      <w:r>
+        <w:rPr>
+          <w:rFonts w:ascii="Helvetica Light" w:hAnsi="Helvetica Light" w:cs="Helvetica Light"/>
+          <w:sz w:val="18"/>
+          <w:szCs w:val="18"/>
+        </w:rPr>
+        <w:t>P10C closes when a merchant can select a frame, edit it manually in Puck, ask AI to redesign another frame, reorder sections, undo/redo, save, preview and publish. `StorefrontSnapshot` remains the shared canonical state; stable identity, approved bounded edits, protected bindings, scoped AI and unified AI/manual history are mandatory.</w:t>
+      </w:r>
+    </w:p>
+    <w:p/>
+    <w:p>
+      <w:pPr/>
+      <w:r>
+        <w:rPr>
+          <w:rFonts w:ascii="Helvetica Light" w:hAnsi="Helvetica Light" w:cs="Helvetica Light"/>
+          <w:sz w:val="18"/>
+          <w:szCs w:val="18"/>
+        </w:rPr>
+        <w:t>AC-119 remains solely a Phase 9 gate. P10C consumes the approved reuse/upload/generate decision; it does not claim the generated-storefront asset matrix or authorize generated imagery before P10D.</w:t>
+      </w:r>
+    </w:p>
+    <w:p/>
+    <w:p>
+      <w:pPr/>
+      <w:r>
+        <w:rPr>
+          <w:rFonts w:ascii="Helvetica Light" w:hAnsi="Helvetica Light" w:cs="Helvetica Light"/>
+          <w:sz w:val="18"/>
+          <w:szCs w:val="18"/>
+        </w:rPr>
+        <w:t>### P10D deferred advanced media and interactive presentation</w:t>
+      </w:r>
+    </w:p>
+    <w:p/>
+    <w:p>
+      <w:pPr/>
+      <w:r>
+        <w:rPr>
+          <w:rFonts w:ascii="Helvetica Light" w:hAnsi="Helvetica Light" w:cs="Helvetica Light"/>
+          <w:sz w:val="18"/>
+          <w:szCs w:val="18"/>
+        </w:rPr>
+        <w:t>Former P10B-03 becomes **P10D-01 Generated-image lifecycle**, after P10B and P10C. P10D also reserves registered video, GLTF/GLB product assets, registered Three.js presentation, camera and lighting presets, mobile/accessibility fallbacks and performance budgets. It does not block P10B or P10C; arbitrary generated Three.js, scripts, shaders, external assets or removal of fallbacks is prohibited.</w:t>
+      </w:r>
+    </w:p>
+    <w:p/>
+    <w:p>
+      <w:pPr/>
+      <w:r>
+        <w:rPr>
+          <w:rFonts w:ascii="Helvetica Light" w:hAnsi="Helvetica Light" w:cs="Helvetica Light"/>
+          <w:sz w:val="18"/>
+          <w:szCs w:val="18"/>
+        </w:rPr>
+        <w:t>### P11 stable domains and Vesko reference adapters</w:t>
+      </w:r>
+    </w:p>
+    <w:p/>
+    <w:p>
+      <w:pPr/>
+      <w:r>
+        <w:rPr>
+          <w:rFonts w:ascii="Helvetica Light" w:hAnsi="Helvetica Light" w:cs="Helvetica Light"/>
+          <w:sz w:val="18"/>
+          <w:szCs w:val="18"/>
+        </w:rPr>
+        <w:t>Former Phase 12 work migrates to P11: canonical product, variant/option, collection/navigation, price/availability presentation, localization, product-media, brand-asset and generated-asset domains, plus versioned media, commerce, navigation and asset adapters with conformance fixtures. Vesko remains the first reference implementation, not a special case embedded through the editor.</w:t>
+      </w:r>
+    </w:p>
+    <w:p/>
+    <w:p>
+      <w:pPr/>
+      <w:r>
+        <w:rPr>
+          <w:rFonts w:ascii="Helvetica Light" w:hAnsi="Helvetica Light" w:cs="Helvetica Light"/>
+          <w:sz w:val="18"/>
+          <w:szCs w:val="18"/>
+        </w:rPr>
+        <w:t>### P12 production hardening and operations</w:t>
+      </w:r>
+    </w:p>
+    <w:p/>
+    <w:p>
+      <w:pPr/>
+      <w:r>
+        <w:rPr>
+          <w:rFonts w:ascii="Helvetica Light" w:hAnsi="Helvetica Light" w:cs="Helvetica Light"/>
+          <w:sz w:val="18"/>
+          <w:szCs w:val="18"/>
+        </w:rPr>
+        <w:t>Former later deployment work follows P11: authentication, authorization, tenant isolation, production persistence and secrets, hosted staging, observability, recovery, pilot operations, deployment and release runbooks. It is not a P10B or P10C prerequisite.</w:t>
       </w:r>
     </w:p>
     <w:p/>
@@ -3608,18 +3315,18 @@
           <w:sz w:val="18"/>
           <w:szCs w:val="18"/>
         </w:rPr>
-        <w:t>AC-136 through AC-138 are P10A commercial-design-vocabulary acceptance criteria implemented by</w:t>
-      </w:r>
-    </w:p>
-    <w:p>
-      <w:pPr/>
-      <w:r>
-        <w:rPr>
-          <w:rFonts w:ascii="Helvetica Light" w:hAnsi="Helvetica Light" w:cs="Helvetica Light"/>
-          <w:sz w:val="18"/>
-          <w:szCs w:val="18"/>
-        </w:rPr>
-        <w:t>P10A Tasks 6–9 after the existing Phase 9 gate closes. They are not required to close Phase 9 and</w:t>
+        <w:t>AC-136 through AC-138 are P10B commercial-design-system acceptance criteria implemented after the</w:t>
+      </w:r>
+    </w:p>
+    <w:p>
+      <w:pPr/>
+      <w:r>
+        <w:rPr>
+          <w:rFonts w:ascii="Helvetica Light" w:hAnsi="Helvetica Light" w:cs="Helvetica Light"/>
+          <w:sz w:val="18"/>
+          <w:szCs w:val="18"/>
+        </w:rPr>
+        <w:t>existing Phase 9 gate and P10A publishing closure. They are not required to close Phase 9 and</w:t>
       </w:r>
     </w:p>
     <w:p>
@@ -4237,19 +3944,19 @@
           <w:sz w:val="18"/>
           <w:szCs w:val="18"/>
         </w:rPr>
-        <w:t>### P10A Task 6 narrative vocabulary and deterministic composition validation</w:t>
-      </w:r>
-    </w:p>
-    <w:p/>
-    <w:p>
-      <w:pPr/>
-      <w:r>
-        <w:rPr>
-          <w:rFonts w:ascii="Helvetica Light" w:hAnsi="Helvetica Light" w:cs="Helvetica Light"/>
-          <w:sz w:val="18"/>
-          <w:szCs w:val="18"/>
-        </w:rPr>
-        <w:t>Task 6 formalizes the controlled middle layer without creating a second page graph, planner,</w:t>
+        <w:t>### P10B-01 narrative vocabulary and deterministic composition validation</w:t>
+      </w:r>
+    </w:p>
+    <w:p/>
+    <w:p>
+      <w:pPr/>
+      <w:r>
+        <w:rPr>
+          <w:rFonts w:ascii="Helvetica Light" w:hAnsi="Helvetica Light" w:cs="Helvetica Light"/>
+          <w:sz w:val="18"/>
+          <w:szCs w:val="18"/>
+        </w:rPr>
+        <w:t>P10B-01 formalizes the controlled middle layer without creating a second page graph, planner,</w:t>
       </w:r>
     </w:p>
     <w:p>
@@ -4571,73 +4278,84 @@
           <w:sz w:val="18"/>
           <w:szCs w:val="18"/>
         </w:rPr>
-        <w:t>adapter until Task 7 adds family-specific commercial metadata; this preserves existing Phase 9</w:t>
-      </w:r>
-    </w:p>
-    <w:p>
-      <w:pPr/>
-      <w:r>
-        <w:rPr>
-          <w:rFonts w:ascii="Helvetica Light" w:hAnsi="Helvetica Light" w:cs="Helvetica Light"/>
-          <w:sz w:val="18"/>
-          <w:szCs w:val="18"/>
-        </w:rPr>
-        <w:t>snapshots and proposals. PageBlueprint plans declare allowed/required roles, flow-rule IDs,</w:t>
-      </w:r>
-    </w:p>
-    <w:p>
-      <w:pPr/>
-      <w:r>
-        <w:rPr>
-          <w:rFonts w:ascii="Helvetica Light" w:hAnsi="Helvetica Light" w:cs="Helvetica Light"/>
-          <w:sz w:val="18"/>
-          <w:szCs w:val="18"/>
-        </w:rPr>
-        <w:t>cardinality, bounded-parameter and responsive constraints while retaining their existing slot,</w:t>
-      </w:r>
-    </w:p>
-    <w:p>
-      <w:pPr/>
-      <w:r>
-        <w:rPr>
-          <w:rFonts w:ascii="Helvetica Light" w:hAnsi="Helvetica Light" w:cs="Helvetica Light"/>
-          <w:sz w:val="18"/>
-          <w:szCs w:val="18"/>
-        </w:rPr>
-        <w:t>family/variant, binding and omission rules. Task 6 supplies contracts and deterministic validation</w:t>
-      </w:r>
-    </w:p>
-    <w:p>
-      <w:pPr/>
-      <w:r>
-        <w:rPr>
-          <w:rFonts w:ascii="Helvetica Light" w:hAnsi="Helvetica Light" w:cs="Helvetica Light"/>
-          <w:sz w:val="18"/>
-          <w:szCs w:val="18"/>
-        </w:rPr>
-        <w:t>only. Task 7 supplies commercial families/variants, Task 8 supplies executable constrained</w:t>
-      </w:r>
-    </w:p>
-    <w:p>
-      <w:pPr/>
-      <w:r>
-        <w:rPr>
-          <w:rFonts w:ascii="Helvetica Light" w:hAnsi="Helvetica Light" w:cs="Helvetica Light"/>
-          <w:sz w:val="18"/>
-          <w:szCs w:val="18"/>
-        </w:rPr>
-        <w:t>PageBlueprint profiles, and Task 9 supplies AI selection plus commercial visual-quality and</w:t>
-      </w:r>
-    </w:p>
-    <w:p>
-      <w:pPr/>
-      <w:r>
-        <w:rPr>
-          <w:rFonts w:ascii="Helvetica Light" w:hAnsi="Helvetica Light" w:cs="Helvetica Light"/>
-          <w:sz w:val="18"/>
-          <w:szCs w:val="18"/>
-        </w:rPr>
-        <w:t>full-chain evidence. Task 6 alone does not claim commercially strong storefront output.</w:t>
+        <w:t>adapter until P10B-04 through P10B-06 add family-specific commercial metadata; this preserves</w:t>
+      </w:r>
+    </w:p>
+    <w:p>
+      <w:pPr/>
+      <w:r>
+        <w:rPr>
+          <w:rFonts w:ascii="Helvetica Light" w:hAnsi="Helvetica Light" w:cs="Helvetica Light"/>
+          <w:sz w:val="18"/>
+          <w:szCs w:val="18"/>
+        </w:rPr>
+        <w:t>existing Phase 9 snapshots and proposals. PageBlueprint plans declare allowed/required roles,</w:t>
+      </w:r>
+    </w:p>
+    <w:p>
+      <w:pPr/>
+      <w:r>
+        <w:rPr>
+          <w:rFonts w:ascii="Helvetica Light" w:hAnsi="Helvetica Light" w:cs="Helvetica Light"/>
+          <w:sz w:val="18"/>
+          <w:szCs w:val="18"/>
+        </w:rPr>
+        <w:t>flow-rule IDs, cardinality, bounded-parameter and responsive constraints while retaining their</w:t>
+      </w:r>
+    </w:p>
+    <w:p>
+      <w:pPr/>
+      <w:r>
+        <w:rPr>
+          <w:rFonts w:ascii="Helvetica Light" w:hAnsi="Helvetica Light" w:cs="Helvetica Light"/>
+          <w:sz w:val="18"/>
+          <w:szCs w:val="18"/>
+        </w:rPr>
+        <w:t>existing slot, family/variant, binding and omission rules. P10B-01 supplies contracts and</w:t>
+      </w:r>
+    </w:p>
+    <w:p>
+      <w:pPr/>
+      <w:r>
+        <w:rPr>
+          <w:rFonts w:ascii="Helvetica Light" w:hAnsi="Helvetica Light" w:cs="Helvetica Light"/>
+          <w:sz w:val="18"/>
+          <w:szCs w:val="18"/>
+        </w:rPr>
+        <w:t>deterministic validation only. P10B-04 through P10B-06 supply commercial families/variants;</w:t>
+      </w:r>
+    </w:p>
+    <w:p>
+      <w:pPr/>
+      <w:r>
+        <w:rPr>
+          <w:rFonts w:ascii="Helvetica Light" w:hAnsi="Helvetica Light" w:cs="Helvetica Light"/>
+          <w:sz w:val="18"/>
+          <w:szCs w:val="18"/>
+        </w:rPr>
+        <w:t>P10B-07/08 supply executable constrained PageBlueprint profiles; P10B-09 through P10B-12 supply</w:t>
+      </w:r>
+    </w:p>
+    <w:p>
+      <w:pPr/>
+      <w:r>
+        <w:rPr>
+          <w:rFonts w:ascii="Helvetica Light" w:hAnsi="Helvetica Light" w:cs="Helvetica Light"/>
+          <w:sz w:val="18"/>
+          <w:szCs w:val="18"/>
+        </w:rPr>
+        <w:t>coordinated direction selection, visual quality and full-chain evidence. P10B-01 alone does not</w:t>
+      </w:r>
+    </w:p>
+    <w:p>
+      <w:pPr/>
+      <w:r>
+        <w:rPr>
+          <w:rFonts w:ascii="Helvetica Light" w:hAnsi="Helvetica Light" w:cs="Helvetica Light"/>
+          <w:sz w:val="18"/>
+          <w:szCs w:val="18"/>
+        </w:rPr>
+        <w:t>claim commercially strong storefront output.</w:t>
       </w:r>
     </w:p>
     <w:p/>
@@ -4727,7 +4445,7 @@
           <w:sz w:val="18"/>
           <w:szCs w:val="18"/>
         </w:rPr>
-        <w:t>Resolved template selections created before Task 6 are persisted as v2 execution identities with no</w:t>
+        <w:t>Resolved template selections created before P10B-01 are persisted as v2 execution identities with no</w:t>
       </w:r>
     </w:p>
     <w:p>
@@ -4749,18 +4467,18 @@
           <w:sz w:val="18"/>
           <w:szCs w:val="18"/>
         </w:rPr>
-        <w:t>each legacy homepage, collection and product plan against the registered pre-Task-6 execution</w:t>
-      </w:r>
-    </w:p>
-    <w:p>
-      <w:pPr/>
-      <w:r>
-        <w:rPr>
-          <w:rFonts w:ascii="Helvetica Light" w:hAnsi="Helvetica Light" w:cs="Helvetica Light"/>
-          <w:sz w:val="18"/>
-          <w:szCs w:val="18"/>
-        </w:rPr>
-        <w:t>identity, then re-resolving that exact registered plan with Task-6 metadata. Modified legacy plans</w:t>
+        <w:t>each legacy homepage, collection and product plan against the registered pre-P10B-01 execution</w:t>
+      </w:r>
+    </w:p>
+    <w:p>
+      <w:pPr/>
+      <w:r>
+        <w:rPr>
+          <w:rFonts w:ascii="Helvetica Light" w:hAnsi="Helvetica Light" w:cs="Helvetica Light"/>
+          <w:sz w:val="18"/>
+          <w:szCs w:val="18"/>
+        </w:rPr>
+        <w:t>identity, then re-resolving that exact registered plan with P10B-01 metadata. Modified legacy plans</w:t>
       </w:r>
     </w:p>
     <w:p>
@@ -4929,7 +4647,7 @@
           <w:sz w:val="18"/>
           <w:szCs w:val="18"/>
         </w:rPr>
-        <w:t>P10A Task 8 implements the coordinated commercial recipes only as registered constrained</w:t>
+        <w:t>P10B-07 and P10B-08 implement the coordinated commercial recipes only as registered constrained</w:t>
       </w:r>
     </w:p>
     <w:p>
@@ -16202,29 +15920,18 @@
           <w:sz w:val="18"/>
           <w:szCs w:val="18"/>
         </w:rPr>
-        <w:t>Phase 12 supplies stable ports, contract tests and a Vesko reference adapter. The staging and</w:t>
-      </w:r>
-    </w:p>
-    <w:p>
-      <w:pPr/>
-      <w:r>
-        <w:rPr>
-          <w:rFonts w:ascii="Helvetica Light" w:hAnsi="Helvetica Light" w:cs="Helvetica Light"/>
-          <w:sz w:val="18"/>
-          <w:szCs w:val="18"/>
-        </w:rPr>
-        <w:t>production rows below are later deployment work; their existence does not make full staging a</w:t>
-      </w:r>
-    </w:p>
-    <w:p>
-      <w:pPr/>
-      <w:r>
-        <w:rPr>
-          <w:rFonts w:ascii="Helvetica Light" w:hAnsi="Helvetica Light" w:cs="Helvetica Light"/>
-          <w:sz w:val="18"/>
-          <w:szCs w:val="18"/>
-        </w:rPr>
-        <w:t>Phase 12 gate.</w:t>
+        <w:t>P11 supplies stable ports, contract tests and a Vesko reference adapter. The staging and production</w:t>
+      </w:r>
+    </w:p>
+    <w:p>
+      <w:pPr/>
+      <w:r>
+        <w:rPr>
+          <w:rFonts w:ascii="Helvetica Light" w:hAnsi="Helvetica Light" w:cs="Helvetica Light"/>
+          <w:sz w:val="18"/>
+          <w:szCs w:val="18"/>
+        </w:rPr>
+        <w:t>rows below are P12 work; their existence does not make full staging a P11 gate.</w:t>
       </w:r>
     </w:p>
     <w:p/>
@@ -17089,18 +16796,18 @@
           <w:sz w:val="18"/>
           <w:szCs w:val="18"/>
         </w:rPr>
-        <w:t>| **AC-131** | Initial storefront generation and follow-up editing have separately identified Skill package contracts with separate schemas, declared authority, quality gates and evidence. Runtime merchant execution remains a Phase 11 responsibility. | FR-105, FR-108, FR-113, NFR-101, NFR-108 |</w:t>
-      </w:r>
-    </w:p>
-    <w:p>
-      <w:pPr/>
-      <w:r>
-        <w:rPr>
-          <w:rFonts w:ascii="Helvetica Light" w:hAnsi="Helvetica Light" w:cs="Helvetica Light"/>
-          <w:sz w:val="18"/>
-          <w:szCs w:val="18"/>
-        </w:rPr>
-        <w:t>| **AC-132** | Scope-classification and instruction-router contracts reject any plan whose declared authority silently widens beyond the selected section, page, shared frame, design system or complete-storefront scope. Runtime merchant controls and execution remain Phase 11 responsibilities. | FR-108, FR-113, NFR-101, NFR-105 |</w:t>
+        <w:t>| **AC-131** | Initial storefront generation and follow-up editing have separately identified Skill package contracts with separate schemas, declared authority, quality gates and evidence. Runtime merchant execution remains a P10C responsibility. | FR-105, FR-108, FR-113, NFR-101, NFR-108 |</w:t>
+      </w:r>
+    </w:p>
+    <w:p>
+      <w:pPr/>
+      <w:r>
+        <w:rPr>
+          <w:rFonts w:ascii="Helvetica Light" w:hAnsi="Helvetica Light" w:cs="Helvetica Light"/>
+          <w:sz w:val="18"/>
+          <w:szCs w:val="18"/>
+        </w:rPr>
+        <w:t>| **AC-132** | Scope-classification and instruction-router contracts reject any plan whose declared authority silently widens beyond the selected section, page, shared frame, design system or complete-storefront scope. Runtime merchant controls and execution remain P10C responsibilities. | FR-108, FR-113, NFR-101, NFR-105 |</w:t>
       </w:r>
     </w:p>
     <w:p>
@@ -17574,18 +17281,18 @@
           <w:sz w:val="18"/>
           <w:szCs w:val="18"/>
         </w:rPr>
-        <w:t>&lt;th&gt;&lt;p&gt;&lt;strong&gt;v1.2.1 roadmap correction&lt;/strong&gt;&lt;/p&gt;</w:t>
-      </w:r>
-    </w:p>
-    <w:p>
-      <w:pPr/>
-      <w:r>
-        <w:rPr>
-          <w:rFonts w:ascii="Helvetica Light" w:hAnsi="Helvetica Light" w:cs="Helvetica Light"/>
-          <w:sz w:val="18"/>
-          <w:szCs w:val="18"/>
-        </w:rPr>
-        <w:t>&lt;p&gt;The controlled lifecycle is retained, but repository infrastructure is not the same as a proven merchant outcome. Phase 9 remains active until meaningful grounded multi-page composition and its complete evidence gate pass. The binding order is Phase 9, P10A grounded orchestration, P10B assets and Studio UX, Phase 11 granular editing, Phase 12 stable domains and reference adapters, then deployment-specific authentication, tenancy, staging and operations.&lt;/p&gt;&lt;/th&gt;</w:t>
+        <w:t>&lt;th&gt;&lt;p&gt;&lt;strong&gt;Authoritative commercial roadmap synchronization&lt;/strong&gt;&lt;/p&gt;</w:t>
+      </w:r>
+    </w:p>
+    <w:p>
+      <w:pPr/>
+      <w:r>
+        <w:rPr>
+          <w:rFonts w:ascii="Helvetica Light" w:hAnsi="Helvetica Light" w:cs="Helvetica Light"/>
+          <w:sz w:val="18"/>
+          <w:szCs w:val="18"/>
+        </w:rPr>
+        <w:t>&lt;p&gt;The controlled lifecycle is retained, but repository infrastructure is not the same as a proven merchant outcome. Phase 9 remains active until meaningful grounded multi-page composition and its complete evidence gate pass. The binding order is Phase 9, P10A publishing closure, P10B Commercial Storefront Design System v1, P10C Storefront Studio Editing Experience v1, deferred P10D advanced registered media, P11 stable domains/reference adapters and P12 production hardening.&lt;/p&gt;&lt;/th&gt;</w:t>
       </w:r>
     </w:p>
     <w:p>
@@ -17862,51 +17569,62 @@
           <w:sz w:val="18"/>
           <w:szCs w:val="18"/>
         </w:rPr>
-        <w:t>| **P10A — Grounded orchestration** | Vocabulary freeze, repository capability audit, executable PageBlueprint contracts, generated Component Knowledge Registry and post-Phase-9 controlled vocabulary scaling, separate Skill package contracts, scoped instruction-router contracts, golden-store evaluation and deterministic publish compiler. P10A defines and validates scopes but does not deliver merchant-operable granular editing. | Generation retrieves what the product can actually build and compiles to the canonical snapshot. | AC-129 through AC-138 pass without a second registry, page graph or publish model; P10A-04 registry generation consumes P10A-03 blueprint contracts and is the only broad vocabulary-scaling activity. |</w:t>
-      </w:r>
-    </w:p>
-    <w:p>
-      <w:pPr/>
-      <w:r>
-        <w:rPr>
-          <w:rFonts w:ascii="Helvetica Light" w:hAnsi="Helvetica Light" w:cs="Helvetica Light"/>
-          <w:sz w:val="18"/>
-          <w:szCs w:val="18"/>
-        </w:rPr>
-        <w:t>| **P10B — Assets and Storefront Studio UX** | Upload/library, roles/provenance, generated-image lifecycle and merchant-facing Studio flows that consume P10A contracts. | Merchants can govern assets and use generation without developer concepts. | Studio-owned AC-121/122/123 evidence passes. AC-119 remains solely a Phase 9 gate. |</w:t>
-      </w:r>
-    </w:p>
-    <w:p>
-      <w:pPr/>
-      <w:r>
-        <w:rPr>
-          <w:rFonts w:ascii="Helvetica Light" w:hAnsi="Helvetica Light" w:cs="Helvetica Light"/>
-          <w:sz w:val="18"/>
-          <w:szCs w:val="18"/>
-        </w:rPr>
-        <w:t>| **P11 — Granular editing** | Runtime selection and execution for selected section/component, current page, shared frame, design system and complete storefront; add/remove/reorder/replace; preview, acceptance, mixed-scope history, Undo/Redo and merchant scope controls/warnings. | Merchants can make controlled local or coordinated changes without unintended scope widening. | Every merchant-operable scope passes permissions, review, atomicity, history and Undo/Redo tests against the P10A contracts. |</w:t>
-      </w:r>
-    </w:p>
-    <w:p>
-      <w:pPr/>
-      <w:r>
-        <w:rPr>
-          <w:rFonts w:ascii="Helvetica Light" w:hAnsi="Helvetica Light" w:cs="Helvetica Light"/>
-          <w:sz w:val="18"/>
-          <w:szCs w:val="18"/>
-        </w:rPr>
-        <w:t>| **P12 — Stable domains and reference adapters** | Consolidate canonical domain and port contracts; provide a Vesko reference adapter and conformance suite. | Vesko teams can integrate without redesigning Veskify or creating competing commerce truth. | Reference adapter passes contract tests; full staging is not required for this phase. |</w:t>
-      </w:r>
-    </w:p>
-    <w:p>
-      <w:pPr/>
-      <w:r>
-        <w:rPr>
-          <w:rFonts w:ascii="Helvetica Light" w:hAnsi="Helvetica Light" w:cs="Helvetica Light"/>
-          <w:sz w:val="18"/>
-          <w:szCs w:val="18"/>
-        </w:rPr>
-        <w:t>| **Later deployment work** | Authentication, tenancy, production operations, deployment, staging transports, rollout and support runbooks. | The integrated product can be operated safely in Vesko environments. | Environment-specific security, reliability and operational gates pass. |</w:t>
+        <w:t>| **P10A — Grounded orchestration and publishing closure** | Vocabulary freeze, capability audit, executable PageBlueprints, registry, Skills/router, quality contracts and deterministic publish compiler. | Generation retrieves real capabilities and publication compiles the canonical snapshot. | P10A-08 closes before P10B; no merchant-operable editing or commercial-quality claim. |</w:t>
+      </w:r>
+    </w:p>
+    <w:p>
+      <w:pPr/>
+      <w:r>
+        <w:rPr>
+          <w:rFonts w:ascii="Helvetica Light" w:hAnsi="Helvetica Light" w:cs="Helvetica Light"/>
+          <w:sz w:val="18"/>
+          <w:szCs w:val="18"/>
+        </w:rPr>
+        <w:t>| **P10B — Commercial Storefront Design System v1** | P10B-01 through P10B-12: vocabulary, foundations, art direction, frame, families, merchandising, collection/PDP profiles, directions, narrative, responsive closure and visual gate. | Complete credible generated storefront without manual reconstruction. | Credible-asset home/collection/simple-PDP/configurable-PDP review at 375/768/1024/1440; no generic starter theme or schema-only closure. |</w:t>
+      </w:r>
+    </w:p>
+    <w:p>
+      <w:pPr/>
+      <w:r>
+        <w:rPr>
+          <w:rFonts w:ascii="Helvetica Light" w:hAnsi="Helvetica Light" w:cs="Helvetica Light"/>
+          <w:sz w:val="18"/>
+          <w:szCs w:val="18"/>
+        </w:rPr>
+        <w:t>| **P10C — Storefront Studio Editing Experience v1** | Migrated asset governance/Studio work plus canonical Puck boundary, frame identity, approved operations, scoped AI and unified history. | Merchant can select/edit/reorder/undo/redo/save/preview/publish. | `StorefrontSnapshot` remains canonical; Puck has no persisted document model. |</w:t>
+      </w:r>
+    </w:p>
+    <w:p>
+      <w:pPr/>
+      <w:r>
+        <w:rPr>
+          <w:rFonts w:ascii="Helvetica Light" w:hAnsi="Helvetica Light" w:cs="Helvetica Light"/>
+          <w:sz w:val="18"/>
+          <w:szCs w:val="18"/>
+        </w:rPr>
+        <w:t>| **P10D — Deferred advanced media and interactive presentation** | Migrated generated-image lifecycle, video, registered GLTF/GLB/Three.js presentation, presets, fallbacks and budgets. | Future rich media when justified. | Does not block P10B/P10C; no arbitrary generated code or Three.js. |</w:t>
+      </w:r>
+    </w:p>
+    <w:p>
+      <w:pPr/>
+      <w:r>
+        <w:rPr>
+          <w:rFonts w:ascii="Helvetica Light" w:hAnsi="Helvetica Light" w:cs="Helvetica Light"/>
+          <w:sz w:val="18"/>
+          <w:szCs w:val="18"/>
+        </w:rPr>
+        <w:t>| **P11 — Stable domains and reference adapters** | Former P12 domains/ports and Vesko conformance adapter. | Integration without competing commerce truth. | Reference adapter passes standalone-equivalent fixtures. |</w:t>
+      </w:r>
+    </w:p>
+    <w:p>
+      <w:pPr/>
+      <w:r>
+        <w:rPr>
+          <w:rFonts w:ascii="Helvetica Light" w:hAnsi="Helvetica Light" w:cs="Helvetica Light"/>
+          <w:sz w:val="18"/>
+          <w:szCs w:val="18"/>
+        </w:rPr>
+        <w:t>| **P12 — Production hardening and operations** | Former later deployment work: auth, tenancy, secrets, staging, observability, recovery and runbooks. | Safely operable integrated product. | Environment-specific operational gates pass. |</w:t>
       </w:r>
     </w:p>
     <w:p/>
@@ -17930,62 +17648,62 @@
           <w:sz w:val="18"/>
           <w:szCs w:val="18"/>
         </w:rPr>
-        <w:t>Execute P10A-01 through P10A-08 in order after Phase 9 closes. Contract owners merge vocabulary,</w:t>
-      </w:r>
-    </w:p>
-    <w:p>
-      <w:pPr/>
-      <w:r>
-        <w:rPr>
-          <w:rFonts w:ascii="Helvetica Light" w:hAnsi="Helvetica Light" w:cs="Helvetica Light"/>
-          <w:sz w:val="18"/>
-          <w:szCs w:val="18"/>
-        </w:rPr>
-        <w:t>capability and executable PageBlueprint foundations before generating the Component Knowledge</w:t>
-      </w:r>
-    </w:p>
-    <w:p>
-      <w:pPr/>
-      <w:r>
-        <w:rPr>
-          <w:rFonts w:ascii="Helvetica Light" w:hAnsi="Helvetica Light" w:cs="Helvetica Light"/>
-          <w:sz w:val="18"/>
-          <w:szCs w:val="18"/>
-        </w:rPr>
-        <w:t>Registry, then merge Skill/router contracts before evaluation and publish-compiler consumers. P10B</w:t>
-      </w:r>
-    </w:p>
-    <w:p>
-      <w:pPr/>
-      <w:r>
-        <w:rPr>
-          <w:rFonts w:ascii="Helvetica Light" w:hAnsi="Helvetica Light" w:cs="Helvetica Light"/>
-          <w:sz w:val="18"/>
-          <w:szCs w:val="18"/>
-        </w:rPr>
-        <w:t>consumes those merged contracts; Phase 11 subsequently implements their editing scopes as</w:t>
-      </w:r>
-    </w:p>
-    <w:p>
-      <w:pPr/>
-      <w:r>
-        <w:rPr>
-          <w:rFonts w:ascii="Helvetica Light" w:hAnsi="Helvetica Light" w:cs="Helvetica Light"/>
-          <w:sz w:val="18"/>
-          <w:szCs w:val="18"/>
-        </w:rPr>
-        <w:t>merchant-operable runtime features. Parallel worktree assignments must still declare owned files,</w:t>
-      </w:r>
-    </w:p>
-    <w:p>
-      <w:pPr/>
-      <w:r>
-        <w:rPr>
-          <w:rFonts w:ascii="Helvetica Light" w:hAnsi="Helvetica Light" w:cs="Helvetica Light"/>
-          <w:sz w:val="18"/>
-          <w:szCs w:val="18"/>
-        </w:rPr>
-        <w:t>dependencies and merge order; a worktree label never changes canonical phase ownership.</w:t>
+        <w:t>Execute P10A-01 through P10A-08 in order after Phase 9 closes, ending with publish closure. Then</w:t>
+      </w:r>
+    </w:p>
+    <w:p>
+      <w:pPr/>
+      <w:r>
+        <w:rPr>
+          <w:rFonts w:ascii="Helvetica Light" w:hAnsi="Helvetica Light" w:cs="Helvetica Light"/>
+          <w:sz w:val="18"/>
+          <w:szCs w:val="18"/>
+        </w:rPr>
+        <w:t>execute P10B-01 through P10B-12 in dependency order before P10C manual/Puck editing. P10C preserves</w:t>
+      </w:r>
+    </w:p>
+    <w:p>
+      <w:pPr/>
+      <w:r>
+        <w:rPr>
+          <w:rFonts w:ascii="Helvetica Light" w:hAnsi="Helvetica Light" w:cs="Helvetica Light"/>
+          <w:sz w:val="18"/>
+          <w:szCs w:val="18"/>
+        </w:rPr>
+        <w:t>and renumbers former P10B asset/Studio tasks; P10D defers generated media and interactive 3D; former</w:t>
+      </w:r>
+    </w:p>
+    <w:p>
+      <w:pPr/>
+      <w:r>
+        <w:rPr>
+          <w:rFonts w:ascii="Helvetica Light" w:hAnsi="Helvetica Light" w:cs="Helvetica Light"/>
+          <w:sz w:val="18"/>
+          <w:szCs w:val="18"/>
+        </w:rPr>
+        <w:t>Phase 12 moves to P11 and former later deployment work moves to P12. Parallel worktree assignments</w:t>
+      </w:r>
+    </w:p>
+    <w:p>
+      <w:pPr/>
+      <w:r>
+        <w:rPr>
+          <w:rFonts w:ascii="Helvetica Light" w:hAnsi="Helvetica Light" w:cs="Helvetica Light"/>
+          <w:sz w:val="18"/>
+          <w:szCs w:val="18"/>
+        </w:rPr>
+        <w:t>must still declare owned files, dependencies and merge order; a worktree label never changes</w:t>
+      </w:r>
+    </w:p>
+    <w:p>
+      <w:pPr/>
+      <w:r>
+        <w:rPr>
+          <w:rFonts w:ascii="Helvetica Light" w:hAnsi="Helvetica Light" w:cs="Helvetica Light"/>
+          <w:sz w:val="18"/>
+          <w:szCs w:val="18"/>
+        </w:rPr>
+        <w:t>canonical phase ownership.</w:t>
       </w:r>
     </w:p>
     <w:p/>

</xml_diff>

<commit_message>
feat: enforce authoritative merchant publishing gateway
</commit_message>
<xml_diff>
--- a/docs/VESKIFY_SDD_v1.2.2.docx
+++ b/docs/VESKIFY_SDD_v1.2.2.docx
@@ -3055,62 +3055,118 @@
           <w:sz w:val="18"/>
           <w:szCs w:val="18"/>
         </w:rPr>
-        <w:t>This seam does not complete active-route publishing. Its in-memory repository is deterministic</w:t>
-      </w:r>
-    </w:p>
-    <w:p>
-      <w:pPr/>
-      <w:r>
-        <w:rPr>
-          <w:rFonts w:ascii="Helvetica Light" w:hAnsi="Helvetica Light" w:cs="Helvetica Light"/>
-          <w:sz w:val="18"/>
-          <w:szCs w:val="18"/>
-        </w:rPr>
-        <w:t>contract evidence, not durable production storage. The current merchant browser publish route is</w:t>
-      </w:r>
-    </w:p>
-    <w:p>
-      <w:pPr/>
-      <w:r>
-        <w:rPr>
-          <w:rFonts w:ascii="Helvetica Light" w:hAnsi="Helvetica Light" w:cs="Helvetica Light"/>
-          <w:sz w:val="18"/>
-          <w:szCs w:val="18"/>
-        </w:rPr>
-        <w:t>not migrated by P10A-08B and continues through explicit manual authority. P10A-08C owns authoritative</w:t>
-      </w:r>
-    </w:p>
-    <w:p>
-      <w:pPr/>
-      <w:r>
-        <w:rPr>
-          <w:rFonts w:ascii="Helvetica Light" w:hAnsi="Helvetica Light" w:cs="Helvetica Light"/>
-          <w:sz w:val="18"/>
-          <w:szCs w:val="18"/>
-        </w:rPr>
-        <w:t>acceptance-endpoint wiring, durable receipt persistence, browser/gateway enforcement, compiled</w:t>
-      </w:r>
-    </w:p>
-    <w:p>
-      <w:pPr/>
-      <w:r>
-        <w:rPr>
-          <w:rFonts w:ascii="Helvetica Light" w:hAnsi="Helvetica Light" w:cs="Helvetica Light"/>
-          <w:sz w:val="18"/>
-          <w:szCs w:val="18"/>
-        </w:rPr>
-        <w:t>runtime publication, atomic active-version switching and rollback closure. Until P10A-08C, the</w:t>
-      </w:r>
-    </w:p>
-    <w:p>
-      <w:pPr/>
-      <w:r>
-        <w:rPr>
-          <w:rFonts w:ascii="Helvetica Light" w:hAnsi="Helvetica Light" w:cs="Helvetica Light"/>
-          <w:sz w:val="18"/>
-          <w:szCs w:val="18"/>
-        </w:rPr>
-        <w:t>active merchant route does not enforce end-to-end AI acceptance lineage.</w:t>
+        <w:t>P10A-08C-01 makes this seam effective at the active merchant route. The browser supplies only a</w:t>
+      </w:r>
+    </w:p>
+    <w:p>
+      <w:pPr/>
+      <w:r>
+        <w:rPr>
+          <w:rFonts w:ascii="Helvetica Light" w:hAnsi="Helvetica Light" w:cs="Helvetica Light"/>
+          <w:sz w:val="18"/>
+          <w:szCs w:val="18"/>
+        </w:rPr>
+        <w:t>manual authority declaration or an accepted-receipt ID to a same-origin server boundary. That boundary</w:t>
+      </w:r>
+    </w:p>
+    <w:p>
+      <w:pPr/>
+      <w:r>
+        <w:rPr>
+          <w:rFonts w:ascii="Helvetica Light" w:hAnsi="Helvetica Light" w:cs="Helvetica Light"/>
+          <w:sz w:val="18"/>
+          <w:szCs w:val="18"/>
+        </w:rPr>
+        <w:t>authenticates the merchant, requires `publishStorefront`, resolves receipt authority from trusted durable</w:t>
+      </w:r>
+    </w:p>
+    <w:p>
+      <w:pPr/>
+      <w:r>
+        <w:rPr>
+          <w:rFonts w:ascii="Helvetica Light" w:hAnsi="Helvetica Light" w:cs="Helvetica Light"/>
+          <w:sz w:val="18"/>
+          <w:szCs w:val="18"/>
+        </w:rPr>
+        <w:t>storage, creates the existing `StorefrontPublishingGateway` request and retains the preparation server-side</w:t>
+      </w:r>
+    </w:p>
+    <w:p>
+      <w:pPr/>
+      <w:r>
+        <w:rPr>
+          <w:rFonts w:ascii="Helvetica Light" w:hAnsi="Helvetica Light" w:cs="Helvetica Light"/>
+          <w:sz w:val="18"/>
+          <w:szCs w:val="18"/>
+        </w:rPr>
+        <w:t>for confirmation. It rechecks receipt/current-state authority at preparation and confirmation; the browser</w:t>
+      </w:r>
+    </w:p>
+    <w:p>
+      <w:pPr/>
+      <w:r>
+        <w:rPr>
+          <w:rFonts w:ascii="Helvetica Light" w:hAnsi="Helvetica Light" w:cs="Helvetica Light"/>
+          <w:sz w:val="18"/>
+          <w:szCs w:val="18"/>
+        </w:rPr>
+        <w:t>cannot mutate a repository, move the published pointer, submit receipt content or fall back from accepted</w:t>
+      </w:r>
+    </w:p>
+    <w:p>
+      <w:pPr/>
+      <w:r>
+        <w:rPr>
+          <w:rFonts w:ascii="Helvetica Light" w:hAnsi="Helvetica Light" w:cs="Helvetica Light"/>
+          <w:sz w:val="18"/>
+          <w:szCs w:val="18"/>
+        </w:rPr>
+        <w:t>AI to manual authority. The narrow server receipt store is create-once and parses immutable receipts on</w:t>
+      </w:r>
+    </w:p>
+    <w:p>
+      <w:pPr/>
+      <w:r>
+        <w:rPr>
+          <w:rFonts w:ascii="Helvetica Light" w:hAnsi="Helvetica Light" w:cs="Helvetica Light"/>
+          <w:sz w:val="18"/>
+          <w:szCs w:val="18"/>
+        </w:rPr>
+        <w:t>retrieval; publication request records are also durable for idempotent retry.</w:t>
+      </w:r>
+    </w:p>
+    <w:p/>
+    <w:p>
+      <w:pPr/>
+      <w:r>
+        <w:rPr>
+          <w:rFonts w:ascii="Helvetica Light" w:hAnsi="Helvetica Light" w:cs="Helvetica Light"/>
+          <w:sz w:val="18"/>
+          <w:szCs w:val="18"/>
+        </w:rPr>
+        <w:t>Manual publication remains explicit and distinct from accepted-AI publication. This work leaves the</w:t>
+      </w:r>
+    </w:p>
+    <w:p>
+      <w:pPr/>
+      <w:r>
+        <w:rPr>
+          <w:rFonts w:ascii="Helvetica Light" w:hAnsi="Helvetica Light" w:cs="Helvetica Light"/>
+          <w:sz w:val="18"/>
+          <w:szCs w:val="18"/>
+        </w:rPr>
+        <w:t>deterministic compiled-runtime artifact, atomic active-version switching, rollback closure and published</w:t>
+      </w:r>
+    </w:p>
+    <w:p>
+      <w:pPr/>
+      <w:r>
+        <w:rPr>
+          <w:rFonts w:ascii="Helvetica Light" w:hAnsi="Helvetica Light" w:cs="Helvetica Light"/>
+          <w:sz w:val="18"/>
+          <w:szCs w:val="18"/>
+        </w:rPr>
+        <w:t>render-target closure to P10A-08C-02; it does not claim compiler closure.</w:t>
       </w:r>
     </w:p>
     <w:p/>

</xml_diff>

<commit_message>
docs: clarify commercial quality ownership
</commit_message>
<xml_diff>
--- a/docs/VESKIFY_SDD_v1.2.2.docx
+++ b/docs/VESKIFY_SDD_v1.2.2.docx
@@ -2843,40 +2843,73 @@
           <w:sz w:val="18"/>
           <w:szCs w:val="18"/>
         </w:rPr>
-        <w:t>and sparse-catalog assumptions. It covers schemas, registered capabilities, bindings/commerce,</w:t>
-      </w:r>
-    </w:p>
-    <w:p>
-      <w:pPr/>
-      <w:r>
-        <w:rPr>
-          <w:rFonts w:ascii="Helvetica Light" w:hAnsi="Helvetica Light" w:cs="Helvetica Light"/>
-          <w:sz w:val="18"/>
-          <w:szCs w:val="18"/>
-        </w:rPr>
-        <w:t>responsive behavior, accessibility, fixture leakage, asset provenance, performance and the contract</w:t>
-      </w:r>
-    </w:p>
-    <w:p>
-      <w:pPr/>
-      <w:r>
-        <w:rPr>
-          <w:rFonts w:ascii="Helvetica Light" w:hAnsi="Helvetica Light" w:cs="Helvetica Light"/>
-          <w:sz w:val="18"/>
-          <w:szCs w:val="18"/>
-        </w:rPr>
-        <w:t>validations owned by P10A. P10B owns the final commercial diversity, cross-page and browser-quality</w:t>
-      </w:r>
-    </w:p>
-    <w:p>
-      <w:pPr/>
-      <w:r>
-        <w:rPr>
-          <w:rFonts w:ascii="Helvetica Light" w:hAnsi="Helvetica Light" w:cs="Helvetica Light"/>
-          <w:sz w:val="18"/>
-          <w:szCs w:val="18"/>
-        </w:rPr>
-        <w:t>gate; runtime mixed-scope history and Undo/Redo for granular editing are P10C gates.</w:t>
+        <w:t>and sparse-catalog assumptions. P10A owns functional and publishing validation for governed</w:t>
+      </w:r>
+    </w:p>
+    <w:p>
+      <w:pPr/>
+      <w:r>
+        <w:rPr>
+          <w:rFonts w:ascii="Helvetica Light" w:hAnsi="Helvetica Light" w:cs="Helvetica Light"/>
+          <w:sz w:val="18"/>
+          <w:szCs w:val="18"/>
+        </w:rPr>
+        <w:t>generation/follow-up execution, routing, proposal lifecycle, controlled-provider acceptance,</w:t>
+      </w:r>
+    </w:p>
+    <w:p>
+      <w:pPr/>
+      <w:r>
+        <w:rPr>
+          <w:rFonts w:ascii="Helvetica Light" w:hAnsi="Helvetica Light" w:cs="Helvetica Light"/>
+          <w:sz w:val="18"/>
+          <w:szCs w:val="18"/>
+        </w:rPr>
+        <w:t>compiler/publish/render/rollback behavior and protected-commerce correctness. P10A does not close</w:t>
+      </w:r>
+    </w:p>
+    <w:p>
+      <w:pPr/>
+      <w:r>
+        <w:rPr>
+          <w:rFonts w:ascii="Helvetica Light" w:hAnsi="Helvetica Light" w:cs="Helvetica Light"/>
+          <w:sz w:val="18"/>
+          <w:szCs w:val="18"/>
+        </w:rPr>
+        <w:t>on commercial visual polish. P10B owns commercial component/profile reachability for new</w:t>
+      </w:r>
+    </w:p>
+    <w:p>
+      <w:pPr/>
+      <w:r>
+        <w:rPr>
+          <w:rFonts w:ascii="Helvetica Light" w:hAnsi="Helvetica Light" w:cs="Helvetica Light"/>
+          <w:sz w:val="18"/>
+          <w:szCs w:val="18"/>
+        </w:rPr>
+        <w:t>design-system capabilities, direction differentiation, credible-asset complete-storefront generation</w:t>
+      </w:r>
+    </w:p>
+    <w:p>
+      <w:pPr/>
+      <w:r>
+        <w:rPr>
+          <w:rFonts w:ascii="Helvetica Light" w:hAnsi="Helvetica Light" w:cs="Helvetica Light"/>
+          <w:sz w:val="18"/>
+          <w:szCs w:val="18"/>
+        </w:rPr>
+        <w:t>and the final commercial screenshot/manual browser-quality gate; runtime mixed-scope history and</w:t>
+      </w:r>
+    </w:p>
+    <w:p>
+      <w:pPr/>
+      <w:r>
+        <w:rPr>
+          <w:rFonts w:ascii="Helvetica Light" w:hAnsi="Helvetica Light" w:cs="Helvetica Light"/>
+          <w:sz w:val="18"/>
+          <w:szCs w:val="18"/>
+        </w:rPr>
+        <w:t>Undo/Redo for granular editing are P10C gates.</w:t>
       </w:r>
     </w:p>
     <w:p/>
@@ -3134,19 +3167,19 @@
           <w:sz w:val="18"/>
           <w:szCs w:val="18"/>
         </w:rPr>
-        <w:t>P10B follows P10A publishing closure and is the first phase that broadens commercial visual quality. It owns P10B-01 executable vocabulary, P10B-02 foundations, P10B-03 image/art direction, P10B-04 premium shared frame, P10B-05 hero/editorial/campaign families, P10B-06 product-card and merchandising system, P10B-07 collection profiles, P10B-08 PDP profiles, P10B-09 coordinated directions, P10B-10 narrative composition, P10B-11 responsive closure and P10B-12 visual-quality gate. These tasks extend only the existing canonical `BrandSystem`, registered `PageBlueprint` profiles, component families/variants, approved asset placement and `StorefrontSnapshot` lifecycle.</w:t>
-      </w:r>
-    </w:p>
-    <w:p/>
-    <w:p>
-      <w:pPr/>
-      <w:r>
-        <w:rPr>
-          <w:rFonts w:ascii="Helvetica Light" w:hAnsi="Helvetica Light" w:cs="Helvetica Light"/>
-          <w:sz w:val="18"/>
-          <w:szCs w:val="18"/>
-        </w:rPr>
-        <w:t>P10B closes only when credible assets prove a complete homepage, collection, simple PDP and configurable PDP at 375, 768, 1024 and 1440 px. Review must prove strong typography and imagery, coherent storytelling, cross-page identity, meaningful directions, commercially credible mobile output and protected-commerce correctness; unit, schema, placeholder, generic-starter-theme, repetitive-stack or unexplained-gap evidence is insufficient.</w:t>
+        <w:t>P10B follows P10A publishing closure and is the first phase that broadens commercial visual quality. It owns commercial component/profile reachability for new design-system capabilities, direction differentiation, credible-asset complete-storefront generation and P10B-01 executable vocabulary, P10B-02 foundations, P10B-03 image/art direction, P10B-04 premium shared frame, P10B-05 hero/editorial/campaign families, P10B-06 product-card and merchandising system, P10B-07 collection profiles, P10B-08 PDP profiles, P10B-09 coordinated directions, P10B-10 narrative composition, P10B-11 responsive closure and P10B-12 visual-quality gate. These tasks extend only the existing canonical `BrandSystem`, registered `PageBlueprint` profiles, component families/variants, approved asset placement and `StorefrontSnapshot` lifecycle.</w:t>
+      </w:r>
+    </w:p>
+    <w:p/>
+    <w:p>
+      <w:pPr/>
+      <w:r>
+        <w:rPr>
+          <w:rFonts w:ascii="Helvetica Light" w:hAnsi="Helvetica Light" w:cs="Helvetica Light"/>
+          <w:sz w:val="18"/>
+          <w:szCs w:val="18"/>
+        </w:rPr>
+        <w:t>P10B closes only when credible assets prove a complete homepage, collection, simple PDP and configurable PDP at 375, 768, 1024 and 1440 px. Manual screenshot/browser review must prove strong typography and imagery, coherent storytelling, cross-page identity, meaningful directions, commercially credible mobile output and protected-commerce correctness; unit, schema, placeholder, generic-starter-theme, repetitive-stack or unexplained-gap evidence is insufficient.</w:t>
       </w:r>
     </w:p>
     <w:p/>
@@ -3218,7 +3251,7 @@
           <w:sz w:val="18"/>
           <w:szCs w:val="18"/>
         </w:rPr>
-        <w:t>Former P10B-03 becomes **P10D-01 Generated-image lifecycle**, after P10B and P10C. P10D also reserves registered video, GLTF/GLB product assets, registered Three.js presentation, camera and lighting presets, mobile/accessibility fallbacks and performance budgets. It does not block P10B or P10C; arbitrary generated Three.js, scripts, shaders, external assets or removal of fallbacks is prohibited.</w:t>
+        <w:t>Former P10B-03 becomes **P10D-01 Generated-image lifecycle**, after P10B and P10C. P10D also reserves registered video, GLTF/GLB product assets, registered Three.js presentation, camera and lighting presets, mobile/accessibility fallbacks and performance budgets. Registered, governed Three.js implementations are permitted only as registered interactive-presentation capabilities. AI may select or configure those capabilities but may not generate implementation code; each remains subject to registered component, asset, performance, accessibility and non-interactive-fallback authority. No arbitrary generated application code or arbitrary/generated Three.js implementation is permitted.</w:t>
       </w:r>
     </w:p>
     <w:p/>
@@ -17782,18 +17815,18 @@
           <w:sz w:val="18"/>
           <w:szCs w:val="18"/>
         </w:rPr>
-        <w:t>| **P10A — Grounded orchestration and publishing closure** | Vocabulary freeze, capability audit, executable PageBlueprints, registry, Skills/router, quality contracts and deterministic publish compiler. | Generation retrieves real capabilities and publication compiles the canonical snapshot. | P10A-08 closes before P10B; no merchant-operable editing or commercial-quality claim. |</w:t>
-      </w:r>
-    </w:p>
-    <w:p>
-      <w:pPr/>
-      <w:r>
-        <w:rPr>
-          <w:rFonts w:ascii="Helvetica Light" w:hAnsi="Helvetica Light" w:cs="Helvetica Light"/>
-          <w:sz w:val="18"/>
-          <w:szCs w:val="18"/>
-        </w:rPr>
-        <w:t>| **P10B — Commercial Storefront Design System v1** | P10B-01 through P10B-12: vocabulary, foundations, art direction, frame, families, merchandising, collection/PDP profiles, directions, narrative, responsive closure and visual gate. | Complete credible generated storefront without manual reconstruction. | Credible-asset home/collection/simple-PDP/configurable-PDP review at 375/768/1024/1440; no generic starter theme or schema-only closure. |</w:t>
+        <w:t>| **P10A — Grounded orchestration and publishing closure** | Vocabulary freeze, capability audit, executable PageBlueprints, registry, Skills/router, functional/publishing quality contracts and deterministic publish compiler. | Governed generation/follow-up execution and publication compile the canonical snapshot. | P10A-08 closes before P10B with controlled-provider, publish/render/rollback and protected-commerce evidence; no merchant-operable editing or commercial-visual-quality claim. |</w:t>
+      </w:r>
+    </w:p>
+    <w:p>
+      <w:pPr/>
+      <w:r>
+        <w:rPr>
+          <w:rFonts w:ascii="Helvetica Light" w:hAnsi="Helvetica Light" w:cs="Helvetica Light"/>
+          <w:sz w:val="18"/>
+          <w:szCs w:val="18"/>
+        </w:rPr>
+        <w:t>| **P10B — Commercial Storefront Design System v1** | P10B-01 through P10B-12: vocabulary, foundations, art direction, frame, families, merchandising, collection/PDP profiles, directions, narrative, responsive closure and visual gate. | Complete credible generated storefront without manual reconstruction. | Commercial component/profile reachability, directions and credible-asset manual screenshot/browser home/collection/simple-PDP/configurable-PDP review at 375/768/1024/1440; no generic starter theme or schema-only closure. |</w:t>
       </w:r>
     </w:p>
     <w:p>
@@ -17815,7 +17848,7 @@
           <w:sz w:val="18"/>
           <w:szCs w:val="18"/>
         </w:rPr>
-        <w:t>| **P10D — Deferred advanced media and interactive presentation** | Migrated generated-image lifecycle, video, registered GLTF/GLB/Three.js presentation, presets, fallbacks and budgets. | Future rich media when justified. | Does not block P10B/P10C; no arbitrary generated code or Three.js. |</w:t>
+        <w:t>| **P10D — Deferred advanced media and interactive presentation** | Migrated generated-image lifecycle, video, registered GLTF/GLB/Three.js presentation, presets, fallbacks and budgets. | Future rich media when justified. | Does not block P10B/P10C; registered governed interactive presentation is permitted, but no arbitrary generated application code or arbitrary/generated Three.js implementation is permitted. |</w:t>
       </w:r>
     </w:p>
     <w:p>

</xml_diff>

<commit_message>
feat: add deterministic publish compiler authority
</commit_message>
<xml_diff>
--- a/docs/VESKIFY_SDD_v1.2.2.docx
+++ b/docs/VESKIFY_SDD_v1.2.2.docx
@@ -3200,6 +3200,173 @@
           <w:szCs w:val="18"/>
         </w:rPr>
         <w:t>render-target closure to P10A-08C-02; it does not claim compiler closure.</w:t>
+      </w:r>
+    </w:p>
+    <w:p/>
+    <w:p>
+      <w:pPr/>
+      <w:r>
+        <w:rPr>
+          <w:rFonts w:ascii="Helvetica Light" w:hAnsi="Helvetica Light" w:cs="Helvetica Light"/>
+          <w:sz w:val="18"/>
+          <w:szCs w:val="18"/>
+        </w:rPr>
+        <w:t>P10A-08C-02A establishes the deterministic publish compiler authority. One write-free application</w:t>
+      </w:r>
+    </w:p>
+    <w:p>
+      <w:pPr/>
+      <w:r>
+        <w:rPr>
+          <w:rFonts w:ascii="Helvetica Light" w:hAnsi="Helvetica Light" w:cs="Helvetica Light"/>
+          <w:sz w:val="18"/>
+          <w:szCs w:val="18"/>
+        </w:rPr>
+        <w:t>compiler accepts unknown input, clones and parses it inside a typed boundary, validates the exact current</w:t>
+      </w:r>
+    </w:p>
+    <w:p>
+      <w:pPr/>
+      <w:r>
+        <w:rPr>
+          <w:rFonts w:ascii="Helvetica Light" w:hAnsi="Helvetica Light" w:cs="Helvetica Light"/>
+          <w:sz w:val="18"/>
+          <w:szCs w:val="18"/>
+        </w:rPr>
+        <w:t>canonical draft against live manifest, component/version/variant, renderer, executable PageBlueprint</w:t>
+      </w:r>
+    </w:p>
+    <w:p>
+      <w:pPr/>
+      <w:r>
+        <w:rPr>
+          <w:rFonts w:ascii="Helvetica Light" w:hAnsi="Helvetica Light" w:cs="Helvetica Light"/>
+          <w:sz w:val="18"/>
+          <w:szCs w:val="18"/>
+        </w:rPr>
+        <w:t>profile, commerce, route/navigation, product-media, approved-asset, locale/accessibility and migration</w:t>
+      </w:r>
+    </w:p>
+    <w:p>
+      <w:pPr/>
+      <w:r>
+        <w:rPr>
+          <w:rFonts w:ascii="Helvetica Light" w:hAnsi="Helvetica Light" w:cs="Helvetica Light"/>
+          <w:sz w:val="18"/>
+          <w:szCs w:val="18"/>
+        </w:rPr>
+        <w:t>authority, and produces one immutable renderer-ready result plus a deterministic compile receipt. The</w:t>
+      </w:r>
+    </w:p>
+    <w:p>
+      <w:pPr/>
+      <w:r>
+        <w:rPr>
+          <w:rFonts w:ascii="Helvetica Light" w:hAnsi="Helvetica Light" w:cs="Helvetica Light"/>
+          <w:sz w:val="18"/>
+          <w:szCs w:val="18"/>
+        </w:rPr>
+        <w:t>result is a derived publication projection only; `StorefrontSnapshot` remains the sole editable storefront</w:t>
+      </w:r>
+    </w:p>
+    <w:p>
+      <w:pPr/>
+      <w:r>
+        <w:rPr>
+          <w:rFonts w:ascii="Helvetica Light" w:hAnsi="Helvetica Light" w:cs="Helvetica Light"/>
+          <w:sz w:val="18"/>
+          <w:szCs w:val="18"/>
+        </w:rPr>
+        <w:t>aggregate and canonical commerce is not copied into the result.</w:t>
+      </w:r>
+    </w:p>
+    <w:p/>
+    <w:p>
+      <w:pPr/>
+      <w:r>
+        <w:rPr>
+          <w:rFonts w:ascii="Helvetica Light" w:hAnsi="Helvetica Light" w:cs="Helvetica Light"/>
+          <w:sz w:val="18"/>
+          <w:szCs w:val="18"/>
+        </w:rPr>
+        <w:t>Preparation compiles both explicit manual and accepted-AI publication, preserving accepted receipt</w:t>
+      </w:r>
+    </w:p>
+    <w:p>
+      <w:pPr/>
+      <w:r>
+        <w:rPr>
+          <w:rFonts w:ascii="Helvetica Light" w:hAnsi="Helvetica Light" w:cs="Helvetica Light"/>
+          <w:sz w:val="18"/>
+          <w:szCs w:val="18"/>
+        </w:rPr>
+        <w:t>lineage where applicable. Trusted server preparation retains the compile receipt and compiled-result</w:t>
+      </w:r>
+    </w:p>
+    <w:p>
+      <w:pPr/>
+      <w:r>
+        <w:rPr>
+          <w:rFonts w:ascii="Helvetica Light" w:hAnsi="Helvetica Light" w:cs="Helvetica Light"/>
+          <w:sz w:val="18"/>
+          <w:szCs w:val="18"/>
+        </w:rPr>
+        <w:t>identity while the browser receives only bounded preparation information and cannot submit compiled</w:t>
+      </w:r>
+    </w:p>
+    <w:p>
+      <w:pPr/>
+      <w:r>
+        <w:rPr>
+          <w:rFonts w:ascii="Helvetica Light" w:hAnsi="Helvetica Light" w:cs="Helvetica Light"/>
+          <w:sz w:val="18"/>
+          <w:szCs w:val="18"/>
+        </w:rPr>
+        <w:t>content or receipt authority. Confirmation resolves current authority again, recompiles the current</w:t>
+      </w:r>
+    </w:p>
+    <w:p>
+      <w:pPr/>
+      <w:r>
+        <w:rPr>
+          <w:rFonts w:ascii="Helvetica Light" w:hAnsi="Helvetica Light" w:cs="Helvetica Light"/>
+          <w:sz w:val="18"/>
+          <w:szCs w:val="18"/>
+        </w:rPr>
+        <w:t>canonical draft and requires exact result-identity and receipt equality before the existing authoritative</w:t>
+      </w:r>
+    </w:p>
+    <w:p>
+      <w:pPr/>
+      <w:r>
+        <w:rPr>
+          <w:rFonts w:ascii="Helvetica Light" w:hAnsi="Helvetica Light" w:cs="Helvetica Light"/>
+          <w:sz w:val="18"/>
+          <w:szCs w:val="18"/>
+        </w:rPr>
+        <w:t>publication command can run. Compiler failure or drift therefore performs no publication write. The full</w:t>
+      </w:r>
+    </w:p>
+    <w:p>
+      <w:pPr/>
+      <w:r>
+        <w:rPr>
+          <w:rFonts w:ascii="Helvetica Light" w:hAnsi="Helvetica Light" w:cs="Helvetica Light"/>
+          <w:sz w:val="18"/>
+          <w:szCs w:val="18"/>
+        </w:rPr>
+        <w:t>compiled result is not yet persisted: P10A-08C-02B owns atomic artifact/pointer/history and</w:t>
+      </w:r>
+    </w:p>
+    <w:p>
+      <w:pPr/>
+      <w:r>
+        <w:rPr>
+          <w:rFonts w:ascii="Helvetica Light" w:hAnsi="Helvetica Light" w:cs="Helvetica Light"/>
+          <w:sz w:val="18"/>
+          <w:szCs w:val="18"/>
+        </w:rPr>
+        <w:t>rollback/republish integration, while P10A-08D-02 owns final published-route browser evidence.</w:t>
       </w:r>
     </w:p>
     <w:p/>

</xml_diff>